<commit_message>
docs(sgrpn): unify terminology and close B1/H1 review items
- A-01: replace "safe" with "selective"/"process-anchored" across EN/ZH manuscripts and asset generator (18 edits); retain group-safe/leakage-safe technical terms

- A-03/B1: remove "finite-sample corrected" algorithmic-guarantee wording (EN L235 / ZH L189)

- A-03/H1: name Phase B as a same-data, multi-seed robustness replication rather than an independent replication

- chore: ignore Office/WPS lock files
</commit_message>
<xml_diff>
--- a/docs/paper/2026-09-17-sgrpn-chinese-review.docx
+++ b/docs/paper/2026-09-17-sgrpn-chinese-review.docx
@@ -12,7 +12,7 @@
           <w:color w:val="000000"/>
           <w:sz w:val="36"/>
         </w:rPr>
-        <w:t>面向铣削表面粗糙度的安全门控残差神经融合与组拆分保形不确定性量化</w:t>
+        <w:t>面向铣削表面粗糙度的选择性门控残差神经融合与组拆分保形不确定性量化</w:t>
       </w:r>
     </w:p>
     <w:p>
@@ -107,7 +107,7 @@
           <w:color w:val="000000"/>
           <w:sz w:val="21"/>
         </w:rPr>
-        <w:t>为此，本文提出SGRPN。工艺多层感知机给出回退均值，卷积振动分支只学习工艺专家的组交叉拟合残差，有界门控控制残差修正量。本文中的“安全”仅具有狭义统计含义，即按照预先规定的阈值评价架构是否降低相对工艺专家的实质性负迁移；它不表示机床功能安全，也不保证任一未来加工组必然获益。均值路径冻结后，利用重复测量拟合尺度模型，并按每个校准组一个最大非一致性分数进行校准，使结论指向可交换新加工组内全部观测类型的同时覆盖。</w:t>
+        <w:t>为此，本文提出SGRPN。工艺多层感知机给出回退均值，卷积振动分支只学习工艺专家的组交叉拟合残差，有界门控控制残差修正量。本文中的“选择性”指按预先规定的阈值评价架构是否降低相对工艺专家的实质性负迁移，而非任何机床功能安全含义，也不保证任一未来加工组必然获益。均值路径冻结后，利用重复测量拟合尺度模型，并按每个校准组一个最大非一致性分数进行校准，使结论指向可交换新加工组内全部观测类型的同时覆盖。</w:t>
       </w:r>
     </w:p>
     <w:p>
@@ -684,6 +684,7 @@
       <w:r>
         <w:rPr>
           <w:rFonts w:ascii="Times New Roman" w:hAnsi="Times New Roman" w:eastAsia="宋体"/>
+          <w:b/>
           <w:color w:val="000000"/>
           <w:sz w:val="21"/>
         </w:rPr>
@@ -697,6 +698,1499 @@
         </w:rPr>
         <w:t>。</w:t>
       </w:r>
+    </w:p>
+    <w:p>
+      <w:pPr>
+        <w:keepNext/>
+        <w:spacing w:before="100" w:after="60"/>
+        <w:ind w:firstLine="0"/>
+      </w:pPr>
+      <w:r>
+        <w:rPr>
+          <w:rFonts w:ascii="Times New Roman" w:hAnsi="Times New Roman" w:eastAsia="宋体"/>
+          <w:b/>
+          <w:color w:val="000000"/>
+          <w:sz w:val="18"/>
+        </w:rPr>
+        <w:t>表1. 数据集与实验结构。</w:t>
+      </w:r>
+    </w:p>
+    <w:tbl>
+      <w:tblPr>
+        <w:tblW w:type="auto" w:w="0"/>
+        <w:jc w:val="center"/>
+        <w:tblLayout w:type="autofit"/>
+        <w:tblLook w:firstColumn="1" w:firstRow="1" w:lastColumn="0" w:lastRow="0" w:noHBand="0" w:noVBand="1" w:val="04A0"/>
+        <w:tblBorders>
+          <w:top w:val="single" w:sz="6" w:space="0" w:color="D9D9D9"/>
+          <w:left w:val="single" w:sz="6" w:space="0" w:color="D9D9D9"/>
+          <w:bottom w:val="single" w:sz="6" w:space="0" w:color="D9D9D9"/>
+          <w:right w:val="single" w:sz="6" w:space="0" w:color="D9D9D9"/>
+          <w:insideH w:val="single" w:sz="6" w:space="0" w:color="D9D9D9"/>
+          <w:insideV w:val="single" w:sz="6" w:space="0" w:color="D9D9D9"/>
+        </w:tblBorders>
+      </w:tblPr>
+      <w:tblGrid>
+        <w:gridCol w:w="2409"/>
+        <w:gridCol w:w="2409"/>
+        <w:gridCol w:w="2409"/>
+        <w:gridCol w:w="2409"/>
+      </w:tblGrid>
+      <w:tr>
+        <w:trPr>
+          <w:tblHeader w:val="true"/>
+        </w:trPr>
+        <w:tc>
+          <w:tcPr>
+            <w:tcW w:type="dxa" w:w="2409"/>
+            <w:vAlign w:val="center"/>
+            <w:tcMar>
+              <w:top w:w="80" w:type="dxa"/>
+              <w:start w:w="90" w:type="dxa"/>
+              <w:bottom w:w="80" w:type="dxa"/>
+              <w:end w:w="90" w:type="dxa"/>
+            </w:tcMar>
+            <w:shd w:fill="1F4E78"/>
+          </w:tcPr>
+          <w:p>
+            <w:pPr>
+              <w:spacing w:before="30" w:after="30" w:line="252" w:lineRule="auto"/>
+              <w:ind w:firstLine="0"/>
+              <w:jc w:val="center"/>
+            </w:pPr>
+            <w:r>
+              <w:rPr>
+                <w:rFonts w:ascii="Times New Roman" w:hAnsi="Times New Roman" w:eastAsia="宋体"/>
+                <w:b/>
+                <w:color w:val="FFFFFF"/>
+                <w:sz w:val="16"/>
+              </w:rPr>
+              <w:t>项目</w:t>
+            </w:r>
+          </w:p>
+        </w:tc>
+        <w:tc>
+          <w:tcPr>
+            <w:tcW w:type="dxa" w:w="2409"/>
+            <w:vAlign w:val="center"/>
+            <w:tcMar>
+              <w:top w:w="80" w:type="dxa"/>
+              <w:start w:w="90" w:type="dxa"/>
+              <w:bottom w:w="80" w:type="dxa"/>
+              <w:end w:w="90" w:type="dxa"/>
+            </w:tcMar>
+            <w:shd w:fill="1F4E78"/>
+          </w:tcPr>
+          <w:p>
+            <w:pPr>
+              <w:spacing w:before="30" w:after="30" w:line="252" w:lineRule="auto"/>
+              <w:ind w:firstLine="0"/>
+              <w:jc w:val="center"/>
+            </w:pPr>
+            <w:r>
+              <w:rPr>
+                <w:rFonts w:ascii="Times New Roman" w:hAnsi="Times New Roman" w:eastAsia="宋体"/>
+                <w:b/>
+                <w:color w:val="FFFFFF"/>
+                <w:sz w:val="16"/>
+              </w:rPr>
+              <w:t>取值</w:t>
+            </w:r>
+          </w:p>
+        </w:tc>
+        <w:tc>
+          <w:tcPr>
+            <w:tcW w:type="dxa" w:w="2409"/>
+            <w:vAlign w:val="center"/>
+            <w:tcMar>
+              <w:top w:w="80" w:type="dxa"/>
+              <w:start w:w="90" w:type="dxa"/>
+              <w:bottom w:w="80" w:type="dxa"/>
+              <w:end w:w="90" w:type="dxa"/>
+            </w:tcMar>
+            <w:shd w:fill="1F4E78"/>
+          </w:tcPr>
+          <w:p>
+            <w:pPr>
+              <w:spacing w:before="30" w:after="30" w:line="252" w:lineRule="auto"/>
+              <w:ind w:firstLine="0"/>
+              <w:jc w:val="center"/>
+            </w:pPr>
+            <w:r>
+              <w:rPr>
+                <w:rFonts w:ascii="Times New Roman" w:hAnsi="Times New Roman" w:eastAsia="宋体"/>
+                <w:b/>
+                <w:color w:val="FFFFFF"/>
+                <w:sz w:val="16"/>
+              </w:rPr>
+              <w:t>定义或范围</w:t>
+            </w:r>
+          </w:p>
+        </w:tc>
+        <w:tc>
+          <w:tcPr>
+            <w:tcW w:type="dxa" w:w="2409"/>
+            <w:vAlign w:val="center"/>
+            <w:tcMar>
+              <w:top w:w="80" w:type="dxa"/>
+              <w:start w:w="90" w:type="dxa"/>
+              <w:bottom w:w="80" w:type="dxa"/>
+              <w:end w:w="90" w:type="dxa"/>
+            </w:tcMar>
+            <w:shd w:fill="1F4E78"/>
+          </w:tcPr>
+          <w:p>
+            <w:pPr>
+              <w:spacing w:before="30" w:after="30" w:line="252" w:lineRule="auto"/>
+              <w:ind w:firstLine="0"/>
+              <w:jc w:val="center"/>
+            </w:pPr>
+            <w:r>
+              <w:rPr>
+                <w:rFonts w:ascii="Times New Roman" w:hAnsi="Times New Roman" w:eastAsia="宋体"/>
+                <w:b/>
+                <w:color w:val="FFFFFF"/>
+                <w:sz w:val="16"/>
+              </w:rPr>
+              <w:t>来源</w:t>
+            </w:r>
+          </w:p>
+        </w:tc>
+      </w:tr>
+      <w:tr>
+        <w:tc>
+          <w:tcPr>
+            <w:tcW w:type="dxa" w:w="2409"/>
+            <w:vAlign w:val="center"/>
+            <w:tcMar>
+              <w:top w:w="80" w:type="dxa"/>
+              <w:start w:w="90" w:type="dxa"/>
+              <w:bottom w:w="80" w:type="dxa"/>
+              <w:end w:w="90" w:type="dxa"/>
+            </w:tcMar>
+          </w:tcPr>
+          <w:p>
+            <w:pPr>
+              <w:spacing w:before="30" w:after="30" w:line="252" w:lineRule="auto"/>
+              <w:ind w:firstLine="0"/>
+            </w:pPr>
+            <w:r>
+              <w:rPr>
+                <w:rFonts w:ascii="Times New Roman" w:hAnsi="Times New Roman" w:eastAsia="宋体"/>
+                <w:color w:val="000000"/>
+                <w:sz w:val="16"/>
+              </w:rPr>
+              <w:t>独立加工组</w:t>
+            </w:r>
+          </w:p>
+        </w:tc>
+        <w:tc>
+          <w:tcPr>
+            <w:tcW w:type="dxa" w:w="2409"/>
+            <w:vAlign w:val="center"/>
+            <w:tcMar>
+              <w:top w:w="80" w:type="dxa"/>
+              <w:start w:w="90" w:type="dxa"/>
+              <w:bottom w:w="80" w:type="dxa"/>
+              <w:end w:w="90" w:type="dxa"/>
+            </w:tcMar>
+          </w:tcPr>
+          <w:p>
+            <w:pPr>
+              <w:spacing w:before="30" w:after="30" w:line="252" w:lineRule="auto"/>
+              <w:ind w:firstLine="0"/>
+              <w:jc w:val="center"/>
+            </w:pPr>
+            <w:r>
+              <w:rPr>
+                <w:rFonts w:ascii="Times New Roman" w:hAnsi="Times New Roman" w:eastAsia="宋体"/>
+                <w:color w:val="000000"/>
+                <w:sz w:val="16"/>
+              </w:rPr>
+              <w:t>212</w:t>
+            </w:r>
+          </w:p>
+        </w:tc>
+        <w:tc>
+          <w:tcPr>
+            <w:tcW w:type="dxa" w:w="2409"/>
+            <w:vAlign w:val="center"/>
+            <w:tcMar>
+              <w:top w:w="80" w:type="dxa"/>
+              <w:start w:w="90" w:type="dxa"/>
+              <w:bottom w:w="80" w:type="dxa"/>
+              <w:end w:w="90" w:type="dxa"/>
+            </w:tcMar>
+          </w:tcPr>
+          <w:p>
+            <w:pPr>
+              <w:spacing w:before="30" w:after="30" w:line="252" w:lineRule="auto"/>
+              <w:ind w:firstLine="0"/>
+              <w:jc w:val="center"/>
+            </w:pPr>
+            <w:r>
+              <w:rPr>
+                <w:rFonts w:ascii="Times New Roman" w:hAnsi="Times New Roman" w:eastAsia="宋体"/>
+                <w:color w:val="000000"/>
+                <w:sz w:val="16"/>
+              </w:rPr>
+              <w:t>外层划分与Bootstrap重采样的基本单元</w:t>
+            </w:r>
+          </w:p>
+        </w:tc>
+        <w:tc>
+          <w:tcPr>
+            <w:tcW w:type="dxa" w:w="2409"/>
+            <w:vAlign w:val="center"/>
+            <w:tcMar>
+              <w:top w:w="80" w:type="dxa"/>
+              <w:start w:w="90" w:type="dxa"/>
+              <w:bottom w:w="80" w:type="dxa"/>
+              <w:end w:w="90" w:type="dxa"/>
+            </w:tcMar>
+          </w:tcPr>
+          <w:p>
+            <w:pPr>
+              <w:spacing w:before="30" w:after="30" w:line="252" w:lineRule="auto"/>
+              <w:ind w:firstLine="0"/>
+              <w:jc w:val="center"/>
+            </w:pPr>
+            <w:r>
+              <w:rPr>
+                <w:rFonts w:ascii="Times New Roman" w:hAnsi="Times New Roman" w:eastAsia="宋体"/>
+                <w:color w:val="000000"/>
+                <w:sz w:val="16"/>
+              </w:rPr>
+              <w:t>Phase A运行清单</w:t>
+            </w:r>
+          </w:p>
+        </w:tc>
+      </w:tr>
+      <w:tr>
+        <w:tc>
+          <w:tcPr>
+            <w:tcW w:type="dxa" w:w="2409"/>
+            <w:vAlign w:val="center"/>
+            <w:tcMar>
+              <w:top w:w="80" w:type="dxa"/>
+              <w:start w:w="90" w:type="dxa"/>
+              <w:bottom w:w="80" w:type="dxa"/>
+              <w:end w:w="90" w:type="dxa"/>
+            </w:tcMar>
+            <w:shd w:fill="EAF2F8"/>
+          </w:tcPr>
+          <w:p>
+            <w:pPr>
+              <w:spacing w:before="30" w:after="30" w:line="252" w:lineRule="auto"/>
+              <w:ind w:firstLine="0"/>
+            </w:pPr>
+            <w:r>
+              <w:rPr>
+                <w:rFonts w:ascii="Times New Roman" w:hAnsi="Times New Roman" w:eastAsia="宋体"/>
+                <w:color w:val="000000"/>
+                <w:sz w:val="16"/>
+              </w:rPr>
+              <w:t>表面区域</w:t>
+            </w:r>
+          </w:p>
+        </w:tc>
+        <w:tc>
+          <w:tcPr>
+            <w:tcW w:type="dxa" w:w="2409"/>
+            <w:vAlign w:val="center"/>
+            <w:tcMar>
+              <w:top w:w="80" w:type="dxa"/>
+              <w:start w:w="90" w:type="dxa"/>
+              <w:bottom w:w="80" w:type="dxa"/>
+              <w:end w:w="90" w:type="dxa"/>
+            </w:tcMar>
+            <w:shd w:fill="EAF2F8"/>
+          </w:tcPr>
+          <w:p>
+            <w:pPr>
+              <w:spacing w:before="30" w:after="30" w:line="252" w:lineRule="auto"/>
+              <w:ind w:firstLine="0"/>
+              <w:jc w:val="center"/>
+            </w:pPr>
+            <w:r>
+              <w:rPr>
+                <w:rFonts w:ascii="Times New Roman" w:hAnsi="Times New Roman" w:eastAsia="宋体"/>
+                <w:color w:val="000000"/>
+                <w:sz w:val="16"/>
+              </w:rPr>
+              <w:t>586</w:t>
+            </w:r>
+          </w:p>
+        </w:tc>
+        <w:tc>
+          <w:tcPr>
+            <w:tcW w:type="dxa" w:w="2409"/>
+            <w:vAlign w:val="center"/>
+            <w:tcMar>
+              <w:top w:w="80" w:type="dxa"/>
+              <w:start w:w="90" w:type="dxa"/>
+              <w:bottom w:w="80" w:type="dxa"/>
+              <w:end w:w="90" w:type="dxa"/>
+            </w:tcMar>
+            <w:shd w:fill="EAF2F8"/>
+          </w:tcPr>
+          <w:p>
+            <w:pPr>
+              <w:spacing w:before="30" w:after="30" w:line="252" w:lineRule="auto"/>
+              <w:ind w:firstLine="0"/>
+              <w:jc w:val="center"/>
+            </w:pPr>
+            <w:r>
+              <w:rPr>
+                <w:rFonts w:ascii="Times New Roman" w:hAnsi="Times New Roman" w:eastAsia="宋体"/>
+                <w:color w:val="000000"/>
+                <w:sz w:val="16"/>
+              </w:rPr>
+              <w:t>预测单元；区域嵌套于加工组内</w:t>
+            </w:r>
+          </w:p>
+        </w:tc>
+        <w:tc>
+          <w:tcPr>
+            <w:tcW w:type="dxa" w:w="2409"/>
+            <w:vAlign w:val="center"/>
+            <w:tcMar>
+              <w:top w:w="80" w:type="dxa"/>
+              <w:start w:w="90" w:type="dxa"/>
+              <w:bottom w:w="80" w:type="dxa"/>
+              <w:end w:w="90" w:type="dxa"/>
+            </w:tcMar>
+            <w:shd w:fill="EAF2F8"/>
+          </w:tcPr>
+          <w:p>
+            <w:pPr>
+              <w:spacing w:before="30" w:after="30" w:line="252" w:lineRule="auto"/>
+              <w:ind w:firstLine="0"/>
+              <w:jc w:val="center"/>
+            </w:pPr>
+            <w:r>
+              <w:rPr>
+                <w:rFonts w:ascii="Times New Roman" w:hAnsi="Times New Roman" w:eastAsia="宋体"/>
+                <w:color w:val="000000"/>
+                <w:sz w:val="16"/>
+              </w:rPr>
+              <w:t>Phase A运行清单</w:t>
+            </w:r>
+          </w:p>
+        </w:tc>
+      </w:tr>
+      <w:tr>
+        <w:tc>
+          <w:tcPr>
+            <w:tcW w:type="dxa" w:w="2409"/>
+            <w:vAlign w:val="center"/>
+            <w:tcMar>
+              <w:top w:w="80" w:type="dxa"/>
+              <w:start w:w="90" w:type="dxa"/>
+              <w:bottom w:w="80" w:type="dxa"/>
+              <w:end w:w="90" w:type="dxa"/>
+            </w:tcMar>
+          </w:tcPr>
+          <w:p>
+            <w:pPr>
+              <w:spacing w:before="30" w:after="30" w:line="252" w:lineRule="auto"/>
+              <w:ind w:firstLine="0"/>
+            </w:pPr>
+            <w:r>
+              <w:rPr>
+                <w:rFonts w:ascii="Times New Roman" w:hAnsi="Times New Roman" w:eastAsia="宋体"/>
+                <w:color w:val="000000"/>
+                <w:sz w:val="16"/>
+              </w:rPr>
+              <w:t>每区域Ra读数</w:t>
+            </w:r>
+          </w:p>
+        </w:tc>
+        <w:tc>
+          <w:tcPr>
+            <w:tcW w:type="dxa" w:w="2409"/>
+            <w:vAlign w:val="center"/>
+            <w:tcMar>
+              <w:top w:w="80" w:type="dxa"/>
+              <w:start w:w="90" w:type="dxa"/>
+              <w:bottom w:w="80" w:type="dxa"/>
+              <w:end w:w="90" w:type="dxa"/>
+            </w:tcMar>
+          </w:tcPr>
+          <w:p>
+            <w:pPr>
+              <w:spacing w:before="30" w:after="30" w:line="252" w:lineRule="auto"/>
+              <w:ind w:firstLine="0"/>
+              <w:jc w:val="center"/>
+            </w:pPr>
+            <w:r>
+              <w:rPr>
+                <w:rFonts w:ascii="Times New Roman" w:hAnsi="Times New Roman" w:eastAsia="宋体"/>
+                <w:color w:val="000000"/>
+                <w:sz w:val="16"/>
+              </w:rPr>
+              <w:t>3</w:t>
+            </w:r>
+          </w:p>
+        </w:tc>
+        <w:tc>
+          <w:tcPr>
+            <w:tcW w:type="dxa" w:w="2409"/>
+            <w:vAlign w:val="center"/>
+            <w:tcMar>
+              <w:top w:w="80" w:type="dxa"/>
+              <w:start w:w="90" w:type="dxa"/>
+              <w:bottom w:w="80" w:type="dxa"/>
+              <w:end w:w="90" w:type="dxa"/>
+            </w:tcMar>
+          </w:tcPr>
+          <w:p>
+            <w:pPr>
+              <w:spacing w:before="30" w:after="30" w:line="252" w:lineRule="auto"/>
+              <w:ind w:firstLine="0"/>
+              <w:jc w:val="center"/>
+            </w:pPr>
+            <w:r>
+              <w:rPr>
+                <w:rFonts w:ascii="Times New Roman" w:hAnsi="Times New Roman" w:eastAsia="宋体"/>
+                <w:color w:val="000000"/>
+                <w:sz w:val="16"/>
+              </w:rPr>
+              <w:t>重复读数共享同一区域级均值与不确定性模型</w:t>
+            </w:r>
+          </w:p>
+        </w:tc>
+        <w:tc>
+          <w:tcPr>
+            <w:tcW w:type="dxa" w:w="2409"/>
+            <w:vAlign w:val="center"/>
+            <w:tcMar>
+              <w:top w:w="80" w:type="dxa"/>
+              <w:start w:w="90" w:type="dxa"/>
+              <w:bottom w:w="80" w:type="dxa"/>
+              <w:end w:w="90" w:type="dxa"/>
+            </w:tcMar>
+          </w:tcPr>
+          <w:p>
+            <w:pPr>
+              <w:spacing w:before="30" w:after="30" w:line="252" w:lineRule="auto"/>
+              <w:ind w:firstLine="0"/>
+              <w:jc w:val="center"/>
+            </w:pPr>
+            <w:r>
+              <w:rPr>
+                <w:rFonts w:ascii="Times New Roman" w:hAnsi="Times New Roman" w:eastAsia="宋体"/>
+                <w:color w:val="000000"/>
+                <w:sz w:val="16"/>
+              </w:rPr>
+              <w:t>冻结的SGRPN协议</w:t>
+            </w:r>
+          </w:p>
+        </w:tc>
+      </w:tr>
+      <w:tr>
+        <w:tc>
+          <w:tcPr>
+            <w:tcW w:type="dxa" w:w="2409"/>
+            <w:vAlign w:val="center"/>
+            <w:tcMar>
+              <w:top w:w="80" w:type="dxa"/>
+              <w:start w:w="90" w:type="dxa"/>
+              <w:bottom w:w="80" w:type="dxa"/>
+              <w:end w:w="90" w:type="dxa"/>
+            </w:tcMar>
+            <w:shd w:fill="EAF2F8"/>
+          </w:tcPr>
+          <w:p>
+            <w:pPr>
+              <w:spacing w:before="30" w:after="30" w:line="252" w:lineRule="auto"/>
+              <w:ind w:firstLine="0"/>
+            </w:pPr>
+            <w:r>
+              <w:rPr>
+                <w:rFonts w:ascii="Times New Roman" w:hAnsi="Times New Roman" w:eastAsia="宋体"/>
+                <w:color w:val="000000"/>
+                <w:sz w:val="16"/>
+              </w:rPr>
+              <w:t>振动通道</w:t>
+            </w:r>
+          </w:p>
+        </w:tc>
+        <w:tc>
+          <w:tcPr>
+            <w:tcW w:type="dxa" w:w="2409"/>
+            <w:vAlign w:val="center"/>
+            <w:tcMar>
+              <w:top w:w="80" w:type="dxa"/>
+              <w:start w:w="90" w:type="dxa"/>
+              <w:bottom w:w="80" w:type="dxa"/>
+              <w:end w:w="90" w:type="dxa"/>
+            </w:tcMar>
+            <w:shd w:fill="EAF2F8"/>
+          </w:tcPr>
+          <w:p>
+            <w:pPr>
+              <w:spacing w:before="30" w:after="30" w:line="252" w:lineRule="auto"/>
+              <w:ind w:firstLine="0"/>
+              <w:jc w:val="center"/>
+            </w:pPr>
+            <w:r>
+              <w:rPr>
+                <w:rFonts w:ascii="Times New Roman" w:hAnsi="Times New Roman" w:eastAsia="宋体"/>
+                <w:color w:val="000000"/>
+                <w:sz w:val="16"/>
+              </w:rPr>
+              <w:t>3（Ch9、Ch10、Ch11）</w:t>
+            </w:r>
+          </w:p>
+        </w:tc>
+        <w:tc>
+          <w:tcPr>
+            <w:tcW w:type="dxa" w:w="2409"/>
+            <w:vAlign w:val="center"/>
+            <w:tcMar>
+              <w:top w:w="80" w:type="dxa"/>
+              <w:start w:w="90" w:type="dxa"/>
+              <w:bottom w:w="80" w:type="dxa"/>
+              <w:end w:w="90" w:type="dxa"/>
+            </w:tcMar>
+            <w:shd w:fill="EAF2F8"/>
+          </w:tcPr>
+          <w:p>
+            <w:pPr>
+              <w:spacing w:before="30" w:after="30" w:line="252" w:lineRule="auto"/>
+              <w:ind w:firstLine="0"/>
+            </w:pPr>
+            <w:r>
+              <w:rPr>
+                <w:rFonts w:ascii="Times New Roman" w:hAnsi="Times New Roman" w:eastAsia="宋体"/>
+                <w:color w:val="000000"/>
+                <w:sz w:val="16"/>
+              </w:rPr>
+              <w:t>Ch11为轴向；Ch9/Ch10的物理方向无法确定，作对称处理</w:t>
+            </w:r>
+          </w:p>
+        </w:tc>
+        <w:tc>
+          <w:tcPr>
+            <w:tcW w:type="dxa" w:w="2409"/>
+            <w:vAlign w:val="center"/>
+            <w:tcMar>
+              <w:top w:w="80" w:type="dxa"/>
+              <w:start w:w="90" w:type="dxa"/>
+              <w:bottom w:w="80" w:type="dxa"/>
+              <w:end w:w="90" w:type="dxa"/>
+            </w:tcMar>
+            <w:shd w:fill="EAF2F8"/>
+          </w:tcPr>
+          <w:p>
+            <w:pPr>
+              <w:spacing w:before="30" w:after="30" w:line="252" w:lineRule="auto"/>
+              <w:ind w:firstLine="0"/>
+              <w:jc w:val="center"/>
+            </w:pPr>
+            <w:r>
+              <w:rPr>
+                <w:rFonts w:ascii="Times New Roman" w:hAnsi="Times New Roman" w:eastAsia="宋体"/>
+                <w:color w:val="000000"/>
+                <w:sz w:val="16"/>
+              </w:rPr>
+              <w:t>冻结的SGRPN协议</w:t>
+            </w:r>
+          </w:p>
+        </w:tc>
+      </w:tr>
+      <w:tr>
+        <w:tc>
+          <w:tcPr>
+            <w:tcW w:type="dxa" w:w="2409"/>
+            <w:vAlign w:val="center"/>
+            <w:tcMar>
+              <w:top w:w="80" w:type="dxa"/>
+              <w:start w:w="90" w:type="dxa"/>
+              <w:bottom w:w="80" w:type="dxa"/>
+              <w:end w:w="90" w:type="dxa"/>
+            </w:tcMar>
+          </w:tcPr>
+          <w:p>
+            <w:pPr>
+              <w:spacing w:before="30" w:after="30" w:line="252" w:lineRule="auto"/>
+              <w:ind w:firstLine="0"/>
+            </w:pPr>
+            <w:r>
+              <w:rPr>
+                <w:rFonts w:ascii="Times New Roman" w:hAnsi="Times New Roman" w:eastAsia="宋体"/>
+                <w:color w:val="000000"/>
+                <w:sz w:val="16"/>
+              </w:rPr>
+              <w:t>振动采样率</w:t>
+            </w:r>
+          </w:p>
+        </w:tc>
+        <w:tc>
+          <w:tcPr>
+            <w:tcW w:type="dxa" w:w="2409"/>
+            <w:vAlign w:val="center"/>
+            <w:tcMar>
+              <w:top w:w="80" w:type="dxa"/>
+              <w:start w:w="90" w:type="dxa"/>
+              <w:bottom w:w="80" w:type="dxa"/>
+              <w:end w:w="90" w:type="dxa"/>
+            </w:tcMar>
+          </w:tcPr>
+          <w:p>
+            <w:pPr>
+              <w:spacing w:before="30" w:after="30" w:line="252" w:lineRule="auto"/>
+              <w:ind w:firstLine="0"/>
+              <w:jc w:val="center"/>
+            </w:pPr>
+            <w:r>
+              <w:rPr>
+                <w:rFonts w:ascii="Times New Roman" w:hAnsi="Times New Roman" w:eastAsia="宋体"/>
+                <w:color w:val="000000"/>
+                <w:sz w:val="16"/>
+              </w:rPr>
+              <w:t>25.6 kHz</w:t>
+            </w:r>
+          </w:p>
+        </w:tc>
+        <w:tc>
+          <w:tcPr>
+            <w:tcW w:type="dxa" w:w="2409"/>
+            <w:vAlign w:val="center"/>
+            <w:tcMar>
+              <w:top w:w="80" w:type="dxa"/>
+              <w:start w:w="90" w:type="dxa"/>
+              <w:bottom w:w="80" w:type="dxa"/>
+              <w:end w:w="90" w:type="dxa"/>
+            </w:tcMar>
+          </w:tcPr>
+          <w:p>
+            <w:pPr>
+              <w:spacing w:before="30" w:after="30" w:line="252" w:lineRule="auto"/>
+              <w:ind w:firstLine="0"/>
+              <w:jc w:val="center"/>
+            </w:pPr>
+            <w:r>
+              <w:rPr>
+                <w:rFonts w:ascii="Times New Roman" w:hAnsi="Times New Roman" w:eastAsia="宋体"/>
+                <w:color w:val="000000"/>
+                <w:sz w:val="16"/>
+              </w:rPr>
+              <w:t>每个保留的模型窗口含25,600个采样点（1 s）</w:t>
+            </w:r>
+          </w:p>
+        </w:tc>
+        <w:tc>
+          <w:tcPr>
+            <w:tcW w:type="dxa" w:w="2409"/>
+            <w:vAlign w:val="center"/>
+            <w:tcMar>
+              <w:top w:w="80" w:type="dxa"/>
+              <w:start w:w="90" w:type="dxa"/>
+              <w:bottom w:w="80" w:type="dxa"/>
+              <w:end w:w="90" w:type="dxa"/>
+            </w:tcMar>
+          </w:tcPr>
+          <w:p>
+            <w:pPr>
+              <w:spacing w:before="30" w:after="30" w:line="252" w:lineRule="auto"/>
+              <w:ind w:firstLine="0"/>
+              <w:jc w:val="center"/>
+            </w:pPr>
+            <w:r>
+              <w:rPr>
+                <w:rFonts w:ascii="Times New Roman" w:hAnsi="Times New Roman" w:eastAsia="宋体"/>
+                <w:color w:val="000000"/>
+                <w:sz w:val="16"/>
+              </w:rPr>
+              <w:t>冻结的SGRPN协议</w:t>
+            </w:r>
+          </w:p>
+        </w:tc>
+      </w:tr>
+      <w:tr>
+        <w:tc>
+          <w:tcPr>
+            <w:tcW w:type="dxa" w:w="2409"/>
+            <w:vAlign w:val="center"/>
+            <w:tcMar>
+              <w:top w:w="80" w:type="dxa"/>
+              <w:start w:w="90" w:type="dxa"/>
+              <w:bottom w:w="80" w:type="dxa"/>
+              <w:end w:w="90" w:type="dxa"/>
+            </w:tcMar>
+            <w:shd w:fill="EAF2F8"/>
+          </w:tcPr>
+          <w:p>
+            <w:pPr>
+              <w:spacing w:before="30" w:after="30" w:line="252" w:lineRule="auto"/>
+              <w:ind w:firstLine="0"/>
+            </w:pPr>
+            <w:r>
+              <w:rPr>
+                <w:rFonts w:ascii="Times New Roman" w:hAnsi="Times New Roman" w:eastAsia="宋体"/>
+                <w:color w:val="000000"/>
+                <w:sz w:val="16"/>
+              </w:rPr>
+              <w:t>主轴转速网格</w:t>
+            </w:r>
+          </w:p>
+        </w:tc>
+        <w:tc>
+          <w:tcPr>
+            <w:tcW w:type="dxa" w:w="2409"/>
+            <w:vAlign w:val="center"/>
+            <w:tcMar>
+              <w:top w:w="80" w:type="dxa"/>
+              <w:start w:w="90" w:type="dxa"/>
+              <w:bottom w:w="80" w:type="dxa"/>
+              <w:end w:w="90" w:type="dxa"/>
+            </w:tcMar>
+            <w:shd w:fill="EAF2F8"/>
+          </w:tcPr>
+          <w:p>
+            <w:pPr>
+              <w:spacing w:before="30" w:after="30" w:line="252" w:lineRule="auto"/>
+              <w:ind w:firstLine="0"/>
+            </w:pPr>
+            <w:r>
+              <w:rPr>
+                <w:rFonts w:ascii="Times New Roman" w:hAnsi="Times New Roman" w:eastAsia="宋体"/>
+                <w:color w:val="000000"/>
+                <w:sz w:val="16"/>
+              </w:rPr>
+              <w:t>10个水平（4000、4500、5000、5500、6000、6500、7000、7500、8000、8500 rpm）</w:t>
+            </w:r>
+          </w:p>
+        </w:tc>
+        <w:tc>
+          <w:tcPr>
+            <w:tcW w:type="dxa" w:w="2409"/>
+            <w:vAlign w:val="center"/>
+            <w:tcMar>
+              <w:top w:w="80" w:type="dxa"/>
+              <w:start w:w="90" w:type="dxa"/>
+              <w:bottom w:w="80" w:type="dxa"/>
+              <w:end w:w="90" w:type="dxa"/>
+            </w:tcMar>
+            <w:shd w:fill="EAF2F8"/>
+          </w:tcPr>
+          <w:p>
+            <w:pPr>
+              <w:spacing w:before="30" w:after="30" w:line="252" w:lineRule="auto"/>
+              <w:ind w:firstLine="0"/>
+              <w:jc w:val="center"/>
+            </w:pPr>
+            <w:r>
+              <w:rPr>
+                <w:rFonts w:ascii="Times New Roman" w:hAnsi="Times New Roman" w:eastAsia="宋体"/>
+                <w:color w:val="000000"/>
+                <w:sz w:val="16"/>
+              </w:rPr>
+              <w:t>冻结的Phase A分解中观测到的水平</w:t>
+            </w:r>
+          </w:p>
+        </w:tc>
+        <w:tc>
+          <w:tcPr>
+            <w:tcW w:type="dxa" w:w="2409"/>
+            <w:vAlign w:val="center"/>
+            <w:tcMar>
+              <w:top w:w="80" w:type="dxa"/>
+              <w:start w:w="90" w:type="dxa"/>
+              <w:bottom w:w="80" w:type="dxa"/>
+              <w:end w:w="90" w:type="dxa"/>
+            </w:tcMar>
+            <w:shd w:fill="EAF2F8"/>
+          </w:tcPr>
+          <w:p>
+            <w:pPr>
+              <w:spacing w:before="30" w:after="30" w:line="252" w:lineRule="auto"/>
+              <w:ind w:firstLine="0"/>
+              <w:jc w:val="center"/>
+            </w:pPr>
+            <w:r>
+              <w:rPr>
+                <w:rFonts w:ascii="Times New Roman" w:hAnsi="Times New Roman" w:eastAsia="宋体"/>
+                <w:color w:val="000000"/>
+                <w:sz w:val="16"/>
+              </w:rPr>
+              <w:t>error_by_n_rpm.csv</w:t>
+            </w:r>
+          </w:p>
+        </w:tc>
+      </w:tr>
+      <w:tr>
+        <w:tc>
+          <w:tcPr>
+            <w:tcW w:type="dxa" w:w="2409"/>
+            <w:vAlign w:val="center"/>
+            <w:tcMar>
+              <w:top w:w="80" w:type="dxa"/>
+              <w:start w:w="90" w:type="dxa"/>
+              <w:bottom w:w="80" w:type="dxa"/>
+              <w:end w:w="90" w:type="dxa"/>
+            </w:tcMar>
+          </w:tcPr>
+          <w:p>
+            <w:pPr>
+              <w:spacing w:before="30" w:after="30" w:line="252" w:lineRule="auto"/>
+              <w:ind w:firstLine="0"/>
+            </w:pPr>
+            <w:r>
+              <w:rPr>
+                <w:rFonts w:ascii="Times New Roman" w:hAnsi="Times New Roman" w:eastAsia="宋体"/>
+                <w:color w:val="000000"/>
+                <w:sz w:val="16"/>
+              </w:rPr>
+              <w:t>每齿进给量网格</w:t>
+            </w:r>
+          </w:p>
+        </w:tc>
+        <w:tc>
+          <w:tcPr>
+            <w:tcW w:type="dxa" w:w="2409"/>
+            <w:vAlign w:val="center"/>
+            <w:tcMar>
+              <w:top w:w="80" w:type="dxa"/>
+              <w:start w:w="90" w:type="dxa"/>
+              <w:bottom w:w="80" w:type="dxa"/>
+              <w:end w:w="90" w:type="dxa"/>
+            </w:tcMar>
+          </w:tcPr>
+          <w:p>
+            <w:pPr>
+              <w:spacing w:before="30" w:after="30" w:line="252" w:lineRule="auto"/>
+              <w:ind w:firstLine="0"/>
+            </w:pPr>
+            <w:r>
+              <w:rPr>
+                <w:rFonts w:ascii="Times New Roman" w:hAnsi="Times New Roman" w:eastAsia="宋体"/>
+                <w:color w:val="000000"/>
+                <w:sz w:val="16"/>
+              </w:rPr>
+              <w:t>5个水平（0.03、0.06、0.09、0.12、0.15 mm/齿）</w:t>
+            </w:r>
+          </w:p>
+        </w:tc>
+        <w:tc>
+          <w:tcPr>
+            <w:tcW w:type="dxa" w:w="2409"/>
+            <w:vAlign w:val="center"/>
+            <w:tcMar>
+              <w:top w:w="80" w:type="dxa"/>
+              <w:start w:w="90" w:type="dxa"/>
+              <w:bottom w:w="80" w:type="dxa"/>
+              <w:end w:w="90" w:type="dxa"/>
+            </w:tcMar>
+          </w:tcPr>
+          <w:p>
+            <w:pPr>
+              <w:spacing w:before="30" w:after="30" w:line="252" w:lineRule="auto"/>
+              <w:ind w:firstLine="0"/>
+              <w:jc w:val="center"/>
+            </w:pPr>
+            <w:r>
+              <w:rPr>
+                <w:rFonts w:ascii="Times New Roman" w:hAnsi="Times New Roman" w:eastAsia="宋体"/>
+                <w:color w:val="000000"/>
+                <w:sz w:val="16"/>
+              </w:rPr>
+              <w:t>冻结的Phase A分解中观测到的水平</w:t>
+            </w:r>
+          </w:p>
+        </w:tc>
+        <w:tc>
+          <w:tcPr>
+            <w:tcW w:type="dxa" w:w="2409"/>
+            <w:vAlign w:val="center"/>
+            <w:tcMar>
+              <w:top w:w="80" w:type="dxa"/>
+              <w:start w:w="90" w:type="dxa"/>
+              <w:bottom w:w="80" w:type="dxa"/>
+              <w:end w:w="90" w:type="dxa"/>
+            </w:tcMar>
+          </w:tcPr>
+          <w:p>
+            <w:pPr>
+              <w:spacing w:before="30" w:after="30" w:line="252" w:lineRule="auto"/>
+              <w:ind w:firstLine="0"/>
+            </w:pPr>
+            <w:r>
+              <w:rPr>
+                <w:rFonts w:ascii="Times New Roman" w:hAnsi="Times New Roman" w:eastAsia="宋体"/>
+                <w:color w:val="000000"/>
+                <w:sz w:val="16"/>
+              </w:rPr>
+              <w:t>error_by_fz_mm_per_tooth.csv</w:t>
+            </w:r>
+          </w:p>
+        </w:tc>
+      </w:tr>
+      <w:tr>
+        <w:tc>
+          <w:tcPr>
+            <w:tcW w:type="dxa" w:w="2409"/>
+            <w:vAlign w:val="center"/>
+            <w:tcMar>
+              <w:top w:w="80" w:type="dxa"/>
+              <w:start w:w="90" w:type="dxa"/>
+              <w:bottom w:w="80" w:type="dxa"/>
+              <w:end w:w="90" w:type="dxa"/>
+            </w:tcMar>
+            <w:shd w:fill="EAF2F8"/>
+          </w:tcPr>
+          <w:p>
+            <w:pPr>
+              <w:spacing w:before="30" w:after="30" w:line="252" w:lineRule="auto"/>
+              <w:ind w:firstLine="0"/>
+            </w:pPr>
+            <w:r>
+              <w:rPr>
+                <w:rFonts w:ascii="Times New Roman" w:hAnsi="Times New Roman" w:eastAsia="宋体"/>
+                <w:color w:val="000000"/>
+                <w:sz w:val="16"/>
+              </w:rPr>
+              <w:t>轴向切深网格</w:t>
+            </w:r>
+          </w:p>
+        </w:tc>
+        <w:tc>
+          <w:tcPr>
+            <w:tcW w:type="dxa" w:w="2409"/>
+            <w:vAlign w:val="center"/>
+            <w:tcMar>
+              <w:top w:w="80" w:type="dxa"/>
+              <w:start w:w="90" w:type="dxa"/>
+              <w:bottom w:w="80" w:type="dxa"/>
+              <w:end w:w="90" w:type="dxa"/>
+            </w:tcMar>
+            <w:shd w:fill="EAF2F8"/>
+          </w:tcPr>
+          <w:p>
+            <w:pPr>
+              <w:spacing w:before="30" w:after="30" w:line="252" w:lineRule="auto"/>
+              <w:ind w:firstLine="0"/>
+              <w:jc w:val="center"/>
+            </w:pPr>
+            <w:r>
+              <w:rPr>
+                <w:rFonts w:ascii="Times New Roman" w:hAnsi="Times New Roman" w:eastAsia="宋体"/>
+                <w:color w:val="000000"/>
+                <w:sz w:val="16"/>
+              </w:rPr>
+              <w:t>4个水平（0.5、1.0、1.5、2.0 mm）</w:t>
+            </w:r>
+          </w:p>
+        </w:tc>
+        <w:tc>
+          <w:tcPr>
+            <w:tcW w:type="dxa" w:w="2409"/>
+            <w:vAlign w:val="center"/>
+            <w:tcMar>
+              <w:top w:w="80" w:type="dxa"/>
+              <w:start w:w="90" w:type="dxa"/>
+              <w:bottom w:w="80" w:type="dxa"/>
+              <w:end w:w="90" w:type="dxa"/>
+            </w:tcMar>
+            <w:shd w:fill="EAF2F8"/>
+          </w:tcPr>
+          <w:p>
+            <w:pPr>
+              <w:spacing w:before="30" w:after="30" w:line="252" w:lineRule="auto"/>
+              <w:ind w:firstLine="0"/>
+              <w:jc w:val="center"/>
+            </w:pPr>
+            <w:r>
+              <w:rPr>
+                <w:rFonts w:ascii="Times New Roman" w:hAnsi="Times New Roman" w:eastAsia="宋体"/>
+                <w:color w:val="000000"/>
+                <w:sz w:val="16"/>
+              </w:rPr>
+              <w:t>冻结的Phase A分解中观测到的水平</w:t>
+            </w:r>
+          </w:p>
+        </w:tc>
+        <w:tc>
+          <w:tcPr>
+            <w:tcW w:type="dxa" w:w="2409"/>
+            <w:vAlign w:val="center"/>
+            <w:tcMar>
+              <w:top w:w="80" w:type="dxa"/>
+              <w:start w:w="90" w:type="dxa"/>
+              <w:bottom w:w="80" w:type="dxa"/>
+              <w:end w:w="90" w:type="dxa"/>
+            </w:tcMar>
+            <w:shd w:fill="EAF2F8"/>
+          </w:tcPr>
+          <w:p>
+            <w:pPr>
+              <w:spacing w:before="30" w:after="30" w:line="252" w:lineRule="auto"/>
+              <w:ind w:firstLine="0"/>
+              <w:jc w:val="center"/>
+            </w:pPr>
+            <w:r>
+              <w:rPr>
+                <w:rFonts w:ascii="Times New Roman" w:hAnsi="Times New Roman" w:eastAsia="宋体"/>
+                <w:color w:val="000000"/>
+                <w:sz w:val="16"/>
+              </w:rPr>
+              <w:t>error_by_ap_mm.csv</w:t>
+            </w:r>
+          </w:p>
+        </w:tc>
+      </w:tr>
+      <w:tr>
+        <w:tc>
+          <w:tcPr>
+            <w:tcW w:type="dxa" w:w="2409"/>
+            <w:vAlign w:val="center"/>
+            <w:tcMar>
+              <w:top w:w="80" w:type="dxa"/>
+              <w:start w:w="90" w:type="dxa"/>
+              <w:bottom w:w="80" w:type="dxa"/>
+              <w:end w:w="90" w:type="dxa"/>
+            </w:tcMar>
+          </w:tcPr>
+          <w:p>
+            <w:pPr>
+              <w:spacing w:before="30" w:after="30" w:line="252" w:lineRule="auto"/>
+              <w:ind w:firstLine="0"/>
+            </w:pPr>
+            <w:r>
+              <w:rPr>
+                <w:rFonts w:ascii="Times New Roman" w:hAnsi="Times New Roman" w:eastAsia="宋体"/>
+                <w:color w:val="000000"/>
+                <w:sz w:val="16"/>
+              </w:rPr>
+              <w:t>已观测工艺组合</w:t>
+            </w:r>
+          </w:p>
+        </w:tc>
+        <w:tc>
+          <w:tcPr>
+            <w:tcW w:type="dxa" w:w="2409"/>
+            <w:vAlign w:val="center"/>
+            <w:tcMar>
+              <w:top w:w="80" w:type="dxa"/>
+              <w:start w:w="90" w:type="dxa"/>
+              <w:bottom w:w="80" w:type="dxa"/>
+              <w:end w:w="90" w:type="dxa"/>
+            </w:tcMar>
+          </w:tcPr>
+          <w:p>
+            <w:pPr>
+              <w:spacing w:before="30" w:after="30" w:line="252" w:lineRule="auto"/>
+              <w:ind w:firstLine="0"/>
+              <w:jc w:val="center"/>
+            </w:pPr>
+            <w:r>
+              <w:rPr>
+                <w:rFonts w:ascii="Times New Roman" w:hAnsi="Times New Roman" w:eastAsia="宋体"/>
+                <w:color w:val="000000"/>
+                <w:sz w:val="16"/>
+              </w:rPr>
+              <w:t>189 / 200</w:t>
+            </w:r>
+          </w:p>
+        </w:tc>
+        <w:tc>
+          <w:tcPr>
+            <w:tcW w:type="dxa" w:w="2409"/>
+            <w:vAlign w:val="center"/>
+            <w:tcMar>
+              <w:top w:w="80" w:type="dxa"/>
+              <w:start w:w="90" w:type="dxa"/>
+              <w:bottom w:w="80" w:type="dxa"/>
+              <w:end w:w="90" w:type="dxa"/>
+            </w:tcMar>
+          </w:tcPr>
+          <w:p>
+            <w:pPr>
+              <w:spacing w:before="30" w:after="30" w:line="252" w:lineRule="auto"/>
+              <w:ind w:firstLine="0"/>
+              <w:jc w:val="center"/>
+            </w:pPr>
+            <w:r>
+              <w:rPr>
+                <w:rFonts w:ascii="Times New Roman" w:hAnsi="Times New Roman" w:eastAsia="宋体"/>
+                <w:color w:val="000000"/>
+                <w:sz w:val="16"/>
+              </w:rPr>
+              <w:t>相对于完整10×5×4网格的已观测组合</w:t>
+            </w:r>
+          </w:p>
+        </w:tc>
+        <w:tc>
+          <w:tcPr>
+            <w:tcW w:type="dxa" w:w="2409"/>
+            <w:vAlign w:val="center"/>
+            <w:tcMar>
+              <w:top w:w="80" w:type="dxa"/>
+              <w:start w:w="90" w:type="dxa"/>
+              <w:bottom w:w="80" w:type="dxa"/>
+              <w:end w:w="90" w:type="dxa"/>
+            </w:tcMar>
+          </w:tcPr>
+          <w:p>
+            <w:pPr>
+              <w:spacing w:before="30" w:after="30" w:line="252" w:lineRule="auto"/>
+              <w:ind w:firstLine="0"/>
+              <w:jc w:val="center"/>
+            </w:pPr>
+            <w:r>
+              <w:rPr>
+                <w:rFonts w:ascii="Times New Roman" w:hAnsi="Times New Roman" w:eastAsia="宋体"/>
+                <w:color w:val="000000"/>
+                <w:sz w:val="16"/>
+              </w:rPr>
+              <w:t>冻结的SGRPN数据规范</w:t>
+            </w:r>
+          </w:p>
+        </w:tc>
+      </w:tr>
+      <w:tr>
+        <w:tc>
+          <w:tcPr>
+            <w:tcW w:type="dxa" w:w="2409"/>
+            <w:vAlign w:val="center"/>
+            <w:tcMar>
+              <w:top w:w="80" w:type="dxa"/>
+              <w:start w:w="90" w:type="dxa"/>
+              <w:bottom w:w="80" w:type="dxa"/>
+              <w:end w:w="90" w:type="dxa"/>
+            </w:tcMar>
+            <w:shd w:fill="EAF2F8"/>
+          </w:tcPr>
+          <w:p>
+            <w:pPr>
+              <w:spacing w:before="30" w:after="30" w:line="252" w:lineRule="auto"/>
+              <w:ind w:firstLine="0"/>
+            </w:pPr>
+            <w:r>
+              <w:rPr>
+                <w:rFonts w:ascii="Times New Roman" w:hAnsi="Times New Roman" w:eastAsia="宋体"/>
+                <w:color w:val="000000"/>
+                <w:sz w:val="16"/>
+              </w:rPr>
+              <w:t>采集版本</w:t>
+            </w:r>
+          </w:p>
+        </w:tc>
+        <w:tc>
+          <w:tcPr>
+            <w:tcW w:type="dxa" w:w="2409"/>
+            <w:vAlign w:val="center"/>
+            <w:tcMar>
+              <w:top w:w="80" w:type="dxa"/>
+              <w:start w:w="90" w:type="dxa"/>
+              <w:bottom w:w="80" w:type="dxa"/>
+              <w:end w:w="90" w:type="dxa"/>
+            </w:tcMar>
+            <w:shd w:fill="EAF2F8"/>
+          </w:tcPr>
+          <w:p>
+            <w:pPr>
+              <w:spacing w:before="30" w:after="30" w:line="252" w:lineRule="auto"/>
+              <w:ind w:firstLine="0"/>
+              <w:jc w:val="center"/>
+            </w:pPr>
+            <w:r>
+              <w:rPr>
+                <w:rFonts w:ascii="Times New Roman" w:hAnsi="Times New Roman" w:eastAsia="宋体"/>
+                <w:color w:val="000000"/>
+                <w:sz w:val="16"/>
+              </w:rPr>
+              <w:t>2（v3、v4）</w:t>
+            </w:r>
+          </w:p>
+        </w:tc>
+        <w:tc>
+          <w:tcPr>
+            <w:tcW w:type="dxa" w:w="2409"/>
+            <w:vAlign w:val="center"/>
+            <w:tcMar>
+              <w:top w:w="80" w:type="dxa"/>
+              <w:start w:w="90" w:type="dxa"/>
+              <w:bottom w:w="80" w:type="dxa"/>
+              <w:end w:w="90" w:type="dxa"/>
+            </w:tcMar>
+            <w:shd w:fill="EAF2F8"/>
+          </w:tcPr>
+          <w:p>
+            <w:pPr>
+              <w:spacing w:before="30" w:after="30" w:line="252" w:lineRule="auto"/>
+              <w:ind w:firstLine="0"/>
+              <w:jc w:val="center"/>
+            </w:pPr>
+            <w:r>
+              <w:rPr>
+                <w:rFonts w:ascii="Times New Roman" w:hAnsi="Times New Roman" w:eastAsia="宋体"/>
+                <w:color w:val="000000"/>
+                <w:sz w:val="16"/>
+              </w:rPr>
+              <w:t>复合域压力测试；版本不作为模型输入</w:t>
+            </w:r>
+          </w:p>
+        </w:tc>
+        <w:tc>
+          <w:tcPr>
+            <w:tcW w:type="dxa" w:w="2409"/>
+            <w:vAlign w:val="center"/>
+            <w:tcMar>
+              <w:top w:w="80" w:type="dxa"/>
+              <w:start w:w="90" w:type="dxa"/>
+              <w:bottom w:w="80" w:type="dxa"/>
+              <w:end w:w="90" w:type="dxa"/>
+            </w:tcMar>
+            <w:shd w:fill="EAF2F8"/>
+          </w:tcPr>
+          <w:p>
+            <w:pPr>
+              <w:spacing w:before="30" w:after="30" w:line="252" w:lineRule="auto"/>
+              <w:ind w:firstLine="0"/>
+              <w:jc w:val="center"/>
+            </w:pPr>
+            <w:r>
+              <w:rPr>
+                <w:rFonts w:ascii="Times New Roman" w:hAnsi="Times New Roman" w:eastAsia="宋体"/>
+                <w:color w:val="000000"/>
+                <w:sz w:val="16"/>
+              </w:rPr>
+              <w:t>error_by_version.csv</w:t>
+            </w:r>
+          </w:p>
+        </w:tc>
+      </w:tr>
+      <w:tr>
+        <w:tc>
+          <w:tcPr>
+            <w:tcW w:type="dxa" w:w="2409"/>
+            <w:vAlign w:val="center"/>
+            <w:tcMar>
+              <w:top w:w="80" w:type="dxa"/>
+              <w:start w:w="90" w:type="dxa"/>
+              <w:bottom w:w="80" w:type="dxa"/>
+              <w:end w:w="90" w:type="dxa"/>
+            </w:tcMar>
+          </w:tcPr>
+          <w:p>
+            <w:pPr>
+              <w:spacing w:before="30" w:after="30" w:line="252" w:lineRule="auto"/>
+              <w:ind w:firstLine="0"/>
+            </w:pPr>
+            <w:r>
+              <w:rPr>
+                <w:rFonts w:ascii="Times New Roman" w:hAnsi="Times New Roman" w:eastAsia="宋体"/>
+                <w:color w:val="000000"/>
+                <w:sz w:val="16"/>
+              </w:rPr>
+              <w:t>外层交叉验证</w:t>
+            </w:r>
+          </w:p>
+        </w:tc>
+        <w:tc>
+          <w:tcPr>
+            <w:tcW w:type="dxa" w:w="2409"/>
+            <w:vAlign w:val="center"/>
+            <w:tcMar>
+              <w:top w:w="80" w:type="dxa"/>
+              <w:start w:w="90" w:type="dxa"/>
+              <w:bottom w:w="80" w:type="dxa"/>
+              <w:end w:w="90" w:type="dxa"/>
+            </w:tcMar>
+          </w:tcPr>
+          <w:p>
+            <w:pPr>
+              <w:spacing w:before="30" w:after="30" w:line="252" w:lineRule="auto"/>
+              <w:ind w:firstLine="0"/>
+              <w:jc w:val="center"/>
+            </w:pPr>
+            <w:r>
+              <w:rPr>
+                <w:rFonts w:ascii="Times New Roman" w:hAnsi="Times New Roman" w:eastAsia="宋体"/>
+                <w:color w:val="000000"/>
+                <w:sz w:val="16"/>
+              </w:rPr>
+              <w:t>5个组不相交折</w:t>
+            </w:r>
+          </w:p>
+        </w:tc>
+        <w:tc>
+          <w:tcPr>
+            <w:tcW w:type="dxa" w:w="2409"/>
+            <w:vAlign w:val="center"/>
+            <w:tcMar>
+              <w:top w:w="80" w:type="dxa"/>
+              <w:start w:w="90" w:type="dxa"/>
+              <w:bottom w:w="80" w:type="dxa"/>
+              <w:end w:w="90" w:type="dxa"/>
+            </w:tcMar>
+          </w:tcPr>
+          <w:p>
+            <w:pPr>
+              <w:spacing w:before="30" w:after="30" w:line="252" w:lineRule="auto"/>
+              <w:ind w:firstLine="0"/>
+              <w:jc w:val="center"/>
+            </w:pPr>
+            <w:r>
+              <w:rPr>
+                <w:rFonts w:ascii="Times New Roman" w:hAnsi="Times New Roman" w:eastAsia="宋体"/>
+                <w:color w:val="000000"/>
+                <w:sz w:val="16"/>
+              </w:rPr>
+              <w:t>记录的组重叠数为0</w:t>
+            </w:r>
+          </w:p>
+        </w:tc>
+        <w:tc>
+          <w:tcPr>
+            <w:tcW w:type="dxa" w:w="2409"/>
+            <w:vAlign w:val="center"/>
+            <w:tcMar>
+              <w:top w:w="80" w:type="dxa"/>
+              <w:start w:w="90" w:type="dxa"/>
+              <w:bottom w:w="80" w:type="dxa"/>
+              <w:end w:w="90" w:type="dxa"/>
+            </w:tcMar>
+          </w:tcPr>
+          <w:p>
+            <w:pPr>
+              <w:spacing w:before="30" w:after="30" w:line="252" w:lineRule="auto"/>
+              <w:ind w:firstLine="0"/>
+              <w:jc w:val="center"/>
+            </w:pPr>
+            <w:r>
+              <w:rPr>
+                <w:rFonts w:ascii="Times New Roman" w:hAnsi="Times New Roman" w:eastAsia="宋体"/>
+                <w:color w:val="000000"/>
+                <w:sz w:val="16"/>
+              </w:rPr>
+              <w:t>Phase A运行清单</w:t>
+            </w:r>
+          </w:p>
+        </w:tc>
+      </w:tr>
+      <w:tr>
+        <w:tc>
+          <w:tcPr>
+            <w:tcW w:type="dxa" w:w="2409"/>
+            <w:vAlign w:val="center"/>
+            <w:tcMar>
+              <w:top w:w="80" w:type="dxa"/>
+              <w:start w:w="90" w:type="dxa"/>
+              <w:bottom w:w="80" w:type="dxa"/>
+              <w:end w:w="90" w:type="dxa"/>
+            </w:tcMar>
+            <w:shd w:fill="EAF2F8"/>
+          </w:tcPr>
+          <w:p>
+            <w:pPr>
+              <w:spacing w:before="30" w:after="30" w:line="252" w:lineRule="auto"/>
+              <w:ind w:firstLine="0"/>
+            </w:pPr>
+            <w:r>
+              <w:rPr>
+                <w:rFonts w:ascii="Times New Roman" w:hAnsi="Times New Roman" w:eastAsia="宋体"/>
+                <w:color w:val="000000"/>
+                <w:sz w:val="16"/>
+              </w:rPr>
+              <w:t>注册随机种子</w:t>
+            </w:r>
+          </w:p>
+        </w:tc>
+        <w:tc>
+          <w:tcPr>
+            <w:tcW w:type="dxa" w:w="2409"/>
+            <w:vAlign w:val="center"/>
+            <w:tcMar>
+              <w:top w:w="80" w:type="dxa"/>
+              <w:start w:w="90" w:type="dxa"/>
+              <w:bottom w:w="80" w:type="dxa"/>
+              <w:end w:w="90" w:type="dxa"/>
+            </w:tcMar>
+            <w:shd w:fill="EAF2F8"/>
+          </w:tcPr>
+          <w:p>
+            <w:pPr>
+              <w:spacing w:before="30" w:after="30" w:line="252" w:lineRule="auto"/>
+              <w:ind w:firstLine="0"/>
+              <w:jc w:val="center"/>
+            </w:pPr>
+            <w:r>
+              <w:rPr>
+                <w:rFonts w:ascii="Times New Roman" w:hAnsi="Times New Roman" w:eastAsia="宋体"/>
+                <w:color w:val="000000"/>
+                <w:sz w:val="16"/>
+              </w:rPr>
+              <w:t>Phase A为1个；Phase B为3个</w:t>
+            </w:r>
+          </w:p>
+        </w:tc>
+        <w:tc>
+          <w:tcPr>
+            <w:tcW w:type="dxa" w:w="2409"/>
+            <w:vAlign w:val="center"/>
+            <w:tcMar>
+              <w:top w:w="80" w:type="dxa"/>
+              <w:start w:w="90" w:type="dxa"/>
+              <w:bottom w:w="80" w:type="dxa"/>
+              <w:end w:w="90" w:type="dxa"/>
+            </w:tcMar>
+            <w:shd w:fill="EAF2F8"/>
+          </w:tcPr>
+          <w:p>
+            <w:pPr>
+              <w:spacing w:before="30" w:after="30" w:line="252" w:lineRule="auto"/>
+              <w:ind w:firstLine="0"/>
+              <w:jc w:val="center"/>
+            </w:pPr>
+            <w:r>
+              <w:rPr>
+                <w:rFonts w:ascii="Times New Roman" w:hAnsi="Times New Roman" w:eastAsia="宋体"/>
+                <w:color w:val="000000"/>
+                <w:sz w:val="16"/>
+              </w:rPr>
+              <w:t>先做Phase A可行性检验，再做冻结的三种子重复</w:t>
+            </w:r>
+          </w:p>
+        </w:tc>
+        <w:tc>
+          <w:tcPr>
+            <w:tcW w:type="dxa" w:w="2409"/>
+            <w:vAlign w:val="center"/>
+            <w:tcMar>
+              <w:top w:w="80" w:type="dxa"/>
+              <w:start w:w="90" w:type="dxa"/>
+              <w:bottom w:w="80" w:type="dxa"/>
+              <w:end w:w="90" w:type="dxa"/>
+            </w:tcMar>
+            <w:shd w:fill="EAF2F8"/>
+          </w:tcPr>
+          <w:p>
+            <w:pPr>
+              <w:spacing w:before="30" w:after="30" w:line="252" w:lineRule="auto"/>
+              <w:ind w:firstLine="0"/>
+              <w:jc w:val="center"/>
+            </w:pPr>
+            <w:r>
+              <w:rPr>
+                <w:rFonts w:ascii="Times New Roman" w:hAnsi="Times New Roman" w:eastAsia="宋体"/>
+                <w:color w:val="000000"/>
+                <w:sz w:val="16"/>
+              </w:rPr>
+              <w:t>Phase A与Phase B协议</w:t>
+            </w:r>
+          </w:p>
+        </w:tc>
+      </w:tr>
+    </w:tbl>
+    <w:p>
+      <w:pPr>
+        <w:spacing w:after="20"/>
+        <w:ind w:firstLine="0"/>
+      </w:pPr>
     </w:p>
     <w:p>
       <w:pPr>
@@ -2170,6 +3664,7 @@
       <w:r>
         <w:rPr>
           <w:rFonts w:ascii="Times New Roman" w:hAnsi="Times New Roman" w:eastAsia="宋体"/>
+          <w:b/>
           <w:color w:val="000000"/>
           <w:sz w:val="21"/>
         </w:rPr>
@@ -2183,6 +3678,1032 @@
         </w:rPr>
         <w:t>。M0为二次工艺岭回归；P1为紧凑工艺神经专家；V1仅使用阶次谱CNN；F1直接融合工艺与振动；R1无门控地加入完整交叉拟合振动残差；G1对同一残差路径应用选择性门控。V1、F1、R1和G1使用相同的阶次谱表示、CNN容量、外层折及组平衡权重。</w:t>
       </w:r>
+    </w:p>
+    <w:p>
+      <w:pPr>
+        <w:keepNext/>
+        <w:spacing w:before="100" w:after="60"/>
+        <w:ind w:firstLine="0"/>
+      </w:pPr>
+      <w:r>
+        <w:rPr>
+          <w:rFonts w:ascii="Times New Roman" w:hAnsi="Times New Roman" w:eastAsia="宋体"/>
+          <w:b/>
+          <w:color w:val="000000"/>
+          <w:sz w:val="18"/>
+        </w:rPr>
+        <w:t>表2. 注册模型与对照模型矩阵。</w:t>
+      </w:r>
+    </w:p>
+    <w:tbl>
+      <w:tblPr>
+        <w:tblW w:type="auto" w:w="0"/>
+        <w:jc w:val="center"/>
+        <w:tblLayout w:type="autofit"/>
+        <w:tblLook w:firstColumn="1" w:firstRow="1" w:lastColumn="0" w:lastRow="0" w:noHBand="0" w:noVBand="1" w:val="04A0"/>
+        <w:tblBorders>
+          <w:top w:val="single" w:sz="6" w:space="0" w:color="D9D9D9"/>
+          <w:left w:val="single" w:sz="6" w:space="0" w:color="D9D9D9"/>
+          <w:bottom w:val="single" w:sz="6" w:space="0" w:color="D9D9D9"/>
+          <w:right w:val="single" w:sz="6" w:space="0" w:color="D9D9D9"/>
+          <w:insideH w:val="single" w:sz="6" w:space="0" w:color="D9D9D9"/>
+          <w:insideV w:val="single" w:sz="6" w:space="0" w:color="D9D9D9"/>
+        </w:tblBorders>
+      </w:tblPr>
+      <w:tblGrid>
+        <w:gridCol w:w="1928"/>
+        <w:gridCol w:w="1928"/>
+        <w:gridCol w:w="1928"/>
+        <w:gridCol w:w="1928"/>
+        <w:gridCol w:w="1928"/>
+      </w:tblGrid>
+      <w:tr>
+        <w:trPr>
+          <w:tblHeader w:val="true"/>
+        </w:trPr>
+        <w:tc>
+          <w:tcPr>
+            <w:tcW w:type="dxa" w:w="1928"/>
+            <w:vAlign w:val="center"/>
+            <w:tcMar>
+              <w:top w:w="80" w:type="dxa"/>
+              <w:start w:w="90" w:type="dxa"/>
+              <w:bottom w:w="80" w:type="dxa"/>
+              <w:end w:w="90" w:type="dxa"/>
+            </w:tcMar>
+            <w:shd w:fill="1F4E78"/>
+          </w:tcPr>
+          <w:p>
+            <w:pPr>
+              <w:spacing w:before="30" w:after="30" w:line="252" w:lineRule="auto"/>
+              <w:ind w:firstLine="0"/>
+              <w:jc w:val="center"/>
+            </w:pPr>
+            <w:r>
+              <w:rPr>
+                <w:rFonts w:ascii="Times New Roman" w:hAnsi="Times New Roman" w:eastAsia="宋体"/>
+                <w:b/>
+                <w:color w:val="FFFFFF"/>
+                <w:sz w:val="16"/>
+              </w:rPr>
+              <w:t>模型</w:t>
+            </w:r>
+          </w:p>
+        </w:tc>
+        <w:tc>
+          <w:tcPr>
+            <w:tcW w:type="dxa" w:w="1928"/>
+            <w:vAlign w:val="center"/>
+            <w:tcMar>
+              <w:top w:w="80" w:type="dxa"/>
+              <w:start w:w="90" w:type="dxa"/>
+              <w:bottom w:w="80" w:type="dxa"/>
+              <w:end w:w="90" w:type="dxa"/>
+            </w:tcMar>
+            <w:shd w:fill="1F4E78"/>
+          </w:tcPr>
+          <w:p>
+            <w:pPr>
+              <w:spacing w:before="30" w:after="30" w:line="252" w:lineRule="auto"/>
+              <w:ind w:firstLine="0"/>
+              <w:jc w:val="center"/>
+            </w:pPr>
+            <w:r>
+              <w:rPr>
+                <w:rFonts w:ascii="Times New Roman" w:hAnsi="Times New Roman" w:eastAsia="宋体"/>
+                <w:b/>
+                <w:color w:val="FFFFFF"/>
+                <w:sz w:val="16"/>
+              </w:rPr>
+              <w:t>结构</w:t>
+            </w:r>
+          </w:p>
+        </w:tc>
+        <w:tc>
+          <w:tcPr>
+            <w:tcW w:type="dxa" w:w="1928"/>
+            <w:vAlign w:val="center"/>
+            <w:tcMar>
+              <w:top w:w="80" w:type="dxa"/>
+              <w:start w:w="90" w:type="dxa"/>
+              <w:bottom w:w="80" w:type="dxa"/>
+              <w:end w:w="90" w:type="dxa"/>
+            </w:tcMar>
+            <w:shd w:fill="1F4E78"/>
+          </w:tcPr>
+          <w:p>
+            <w:pPr>
+              <w:spacing w:before="30" w:after="30" w:line="252" w:lineRule="auto"/>
+              <w:ind w:firstLine="0"/>
+              <w:jc w:val="center"/>
+            </w:pPr>
+            <w:r>
+              <w:rPr>
+                <w:rFonts w:ascii="Times New Roman" w:hAnsi="Times New Roman" w:eastAsia="宋体"/>
+                <w:b/>
+                <w:color w:val="FFFFFF"/>
+                <w:sz w:val="16"/>
+              </w:rPr>
+              <w:t>输入</w:t>
+            </w:r>
+          </w:p>
+        </w:tc>
+        <w:tc>
+          <w:tcPr>
+            <w:tcW w:type="dxa" w:w="1928"/>
+            <w:vAlign w:val="center"/>
+            <w:tcMar>
+              <w:top w:w="80" w:type="dxa"/>
+              <w:start w:w="90" w:type="dxa"/>
+              <w:bottom w:w="80" w:type="dxa"/>
+              <w:end w:w="90" w:type="dxa"/>
+            </w:tcMar>
+            <w:shd w:fill="1F4E78"/>
+          </w:tcPr>
+          <w:p>
+            <w:pPr>
+              <w:spacing w:before="30" w:after="30" w:line="252" w:lineRule="auto"/>
+              <w:ind w:firstLine="0"/>
+              <w:jc w:val="center"/>
+            </w:pPr>
+            <w:r>
+              <w:rPr>
+                <w:rFonts w:ascii="Times New Roman" w:hAnsi="Times New Roman" w:eastAsia="宋体"/>
+                <w:b/>
+                <w:color w:val="FFFFFF"/>
+                <w:sz w:val="16"/>
+              </w:rPr>
+              <w:t>训练靶值</w:t>
+            </w:r>
+          </w:p>
+        </w:tc>
+        <w:tc>
+          <w:tcPr>
+            <w:tcW w:type="dxa" w:w="1928"/>
+            <w:vAlign w:val="center"/>
+            <w:tcMar>
+              <w:top w:w="80" w:type="dxa"/>
+              <w:start w:w="90" w:type="dxa"/>
+              <w:bottom w:w="80" w:type="dxa"/>
+              <w:end w:w="90" w:type="dxa"/>
+            </w:tcMar>
+            <w:shd w:fill="1F4E78"/>
+          </w:tcPr>
+          <w:p>
+            <w:pPr>
+              <w:spacing w:before="30" w:after="30" w:line="252" w:lineRule="auto"/>
+              <w:ind w:firstLine="0"/>
+              <w:jc w:val="center"/>
+            </w:pPr>
+            <w:r>
+              <w:rPr>
+                <w:rFonts w:ascii="Times New Roman" w:hAnsi="Times New Roman" w:eastAsia="宋体"/>
+                <w:b/>
+                <w:color w:val="FFFFFF"/>
+                <w:sz w:val="16"/>
+              </w:rPr>
+              <w:t>角色</w:t>
+            </w:r>
+          </w:p>
+        </w:tc>
+      </w:tr>
+      <w:tr>
+        <w:tc>
+          <w:tcPr>
+            <w:tcW w:type="dxa" w:w="1928"/>
+            <w:vAlign w:val="center"/>
+            <w:tcMar>
+              <w:top w:w="80" w:type="dxa"/>
+              <w:start w:w="90" w:type="dxa"/>
+              <w:bottom w:w="80" w:type="dxa"/>
+              <w:end w:w="90" w:type="dxa"/>
+            </w:tcMar>
+          </w:tcPr>
+          <w:p>
+            <w:pPr>
+              <w:spacing w:before="30" w:after="30" w:line="252" w:lineRule="auto"/>
+              <w:ind w:firstLine="0"/>
+            </w:pPr>
+            <w:r>
+              <w:rPr>
+                <w:rFonts w:ascii="Times New Roman" w:hAnsi="Times New Roman" w:eastAsia="宋体"/>
+                <w:color w:val="000000"/>
+                <w:sz w:val="16"/>
+              </w:rPr>
+              <w:t>M0</w:t>
+            </w:r>
+          </w:p>
+        </w:tc>
+        <w:tc>
+          <w:tcPr>
+            <w:tcW w:type="dxa" w:w="1928"/>
+            <w:vAlign w:val="center"/>
+            <w:tcMar>
+              <w:top w:w="80" w:type="dxa"/>
+              <w:start w:w="90" w:type="dxa"/>
+              <w:bottom w:w="80" w:type="dxa"/>
+              <w:end w:w="90" w:type="dxa"/>
+            </w:tcMar>
+          </w:tcPr>
+          <w:p>
+            <w:pPr>
+              <w:spacing w:before="30" w:after="30" w:line="252" w:lineRule="auto"/>
+              <w:ind w:firstLine="0"/>
+              <w:jc w:val="center"/>
+            </w:pPr>
+            <w:r>
+              <w:rPr>
+                <w:rFonts w:ascii="Times New Roman" w:hAnsi="Times New Roman" w:eastAsia="宋体"/>
+                <w:color w:val="000000"/>
+                <w:sz w:val="16"/>
+              </w:rPr>
+              <w:t>二次工艺岭回归</w:t>
+            </w:r>
+          </w:p>
+        </w:tc>
+        <w:tc>
+          <w:tcPr>
+            <w:tcW w:type="dxa" w:w="1928"/>
+            <w:vAlign w:val="center"/>
+            <w:tcMar>
+              <w:top w:w="80" w:type="dxa"/>
+              <w:start w:w="90" w:type="dxa"/>
+              <w:bottom w:w="80" w:type="dxa"/>
+              <w:end w:w="90" w:type="dxa"/>
+            </w:tcMar>
+          </w:tcPr>
+          <w:p>
+            <w:pPr>
+              <w:spacing w:before="30" w:after="30" w:line="252" w:lineRule="auto"/>
+              <w:ind w:firstLine="0"/>
+              <w:jc w:val="center"/>
+            </w:pPr>
+            <w:r>
+              <w:rPr>
+                <w:rFonts w:ascii="Times New Roman" w:hAnsi="Times New Roman" w:eastAsia="宋体"/>
+                <w:color w:val="000000"/>
+                <w:sz w:val="16"/>
+              </w:rPr>
+              <w:t>工艺参数及注册的二次项</w:t>
+            </w:r>
+          </w:p>
+        </w:tc>
+        <w:tc>
+          <w:tcPr>
+            <w:tcW w:type="dxa" w:w="1928"/>
+            <w:vAlign w:val="center"/>
+            <w:tcMar>
+              <w:top w:w="80" w:type="dxa"/>
+              <w:start w:w="90" w:type="dxa"/>
+              <w:bottom w:w="80" w:type="dxa"/>
+              <w:end w:w="90" w:type="dxa"/>
+            </w:tcMar>
+          </w:tcPr>
+          <w:p>
+            <w:pPr>
+              <w:spacing w:before="30" w:after="30" w:line="252" w:lineRule="auto"/>
+              <w:ind w:firstLine="0"/>
+              <w:jc w:val="center"/>
+            </w:pPr>
+            <w:r>
+              <w:rPr>
+                <w:rFonts w:ascii="Times New Roman" w:hAnsi="Times New Roman" w:eastAsia="宋体"/>
+                <w:color w:val="000000"/>
+                <w:sz w:val="16"/>
+              </w:rPr>
+              <w:t>区域平均Ra</w:t>
+            </w:r>
+          </w:p>
+        </w:tc>
+        <w:tc>
+          <w:tcPr>
+            <w:tcW w:type="dxa" w:w="1928"/>
+            <w:vAlign w:val="center"/>
+            <w:tcMar>
+              <w:top w:w="80" w:type="dxa"/>
+              <w:start w:w="90" w:type="dxa"/>
+              <w:bottom w:w="80" w:type="dxa"/>
+              <w:end w:w="90" w:type="dxa"/>
+            </w:tcMar>
+          </w:tcPr>
+          <w:p>
+            <w:pPr>
+              <w:spacing w:before="30" w:after="30" w:line="252" w:lineRule="auto"/>
+              <w:ind w:firstLine="0"/>
+              <w:jc w:val="center"/>
+            </w:pPr>
+            <w:r>
+              <w:rPr>
+                <w:rFonts w:ascii="Times New Roman" w:hAnsi="Times New Roman" w:eastAsia="宋体"/>
+                <w:color w:val="000000"/>
+                <w:sz w:val="16"/>
+              </w:rPr>
+              <w:t>强传统工艺基线</w:t>
+            </w:r>
+          </w:p>
+        </w:tc>
+      </w:tr>
+      <w:tr>
+        <w:tc>
+          <w:tcPr>
+            <w:tcW w:type="dxa" w:w="1928"/>
+            <w:vAlign w:val="center"/>
+            <w:tcMar>
+              <w:top w:w="80" w:type="dxa"/>
+              <w:start w:w="90" w:type="dxa"/>
+              <w:bottom w:w="80" w:type="dxa"/>
+              <w:end w:w="90" w:type="dxa"/>
+            </w:tcMar>
+            <w:shd w:fill="EAF2F8"/>
+          </w:tcPr>
+          <w:p>
+            <w:pPr>
+              <w:spacing w:before="30" w:after="30" w:line="252" w:lineRule="auto"/>
+              <w:ind w:firstLine="0"/>
+            </w:pPr>
+            <w:r>
+              <w:rPr>
+                <w:rFonts w:ascii="Times New Roman" w:hAnsi="Times New Roman" w:eastAsia="宋体"/>
+                <w:color w:val="000000"/>
+                <w:sz w:val="16"/>
+              </w:rPr>
+              <w:t>P1</w:t>
+            </w:r>
+          </w:p>
+        </w:tc>
+        <w:tc>
+          <w:tcPr>
+            <w:tcW w:type="dxa" w:w="1928"/>
+            <w:vAlign w:val="center"/>
+            <w:tcMar>
+              <w:top w:w="80" w:type="dxa"/>
+              <w:start w:w="90" w:type="dxa"/>
+              <w:bottom w:w="80" w:type="dxa"/>
+              <w:end w:w="90" w:type="dxa"/>
+            </w:tcMar>
+            <w:shd w:fill="EAF2F8"/>
+          </w:tcPr>
+          <w:p>
+            <w:pPr>
+              <w:spacing w:before="30" w:after="30" w:line="252" w:lineRule="auto"/>
+              <w:ind w:firstLine="0"/>
+              <w:jc w:val="center"/>
+            </w:pPr>
+            <w:r>
+              <w:rPr>
+                <w:rFonts w:ascii="Times New Roman" w:hAnsi="Times New Roman" w:eastAsia="宋体"/>
+                <w:color w:val="000000"/>
+                <w:sz w:val="16"/>
+              </w:rPr>
+              <w:t>工艺MLP</w:t>
+            </w:r>
+          </w:p>
+        </w:tc>
+        <w:tc>
+          <w:tcPr>
+            <w:tcW w:type="dxa" w:w="1928"/>
+            <w:vAlign w:val="center"/>
+            <w:tcMar>
+              <w:top w:w="80" w:type="dxa"/>
+              <w:start w:w="90" w:type="dxa"/>
+              <w:bottom w:w="80" w:type="dxa"/>
+              <w:end w:w="90" w:type="dxa"/>
+            </w:tcMar>
+            <w:shd w:fill="EAF2F8"/>
+          </w:tcPr>
+          <w:p>
+            <w:pPr>
+              <w:spacing w:before="30" w:after="30" w:line="252" w:lineRule="auto"/>
+              <w:ind w:firstLine="0"/>
+              <w:jc w:val="center"/>
+            </w:pPr>
+            <w:r>
+              <w:rPr>
+                <w:rFonts w:ascii="Times New Roman" w:hAnsi="Times New Roman" w:eastAsia="宋体"/>
+                <w:color w:val="000000"/>
+                <w:sz w:val="16"/>
+              </w:rPr>
+              <w:t>9个标准化工艺特征</w:t>
+            </w:r>
+          </w:p>
+        </w:tc>
+        <w:tc>
+          <w:tcPr>
+            <w:tcW w:type="dxa" w:w="1928"/>
+            <w:vAlign w:val="center"/>
+            <w:tcMar>
+              <w:top w:w="80" w:type="dxa"/>
+              <w:start w:w="90" w:type="dxa"/>
+              <w:bottom w:w="80" w:type="dxa"/>
+              <w:end w:w="90" w:type="dxa"/>
+            </w:tcMar>
+            <w:shd w:fill="EAF2F8"/>
+          </w:tcPr>
+          <w:p>
+            <w:pPr>
+              <w:spacing w:before="30" w:after="30" w:line="252" w:lineRule="auto"/>
+              <w:ind w:firstLine="0"/>
+              <w:jc w:val="center"/>
+            </w:pPr>
+            <w:r>
+              <w:rPr>
+                <w:rFonts w:ascii="Times New Roman" w:hAnsi="Times New Roman" w:eastAsia="宋体"/>
+                <w:color w:val="000000"/>
+                <w:sz w:val="16"/>
+              </w:rPr>
+              <w:t>区域平均Ra</w:t>
+            </w:r>
+          </w:p>
+        </w:tc>
+        <w:tc>
+          <w:tcPr>
+            <w:tcW w:type="dxa" w:w="1928"/>
+            <w:vAlign w:val="center"/>
+            <w:tcMar>
+              <w:top w:w="80" w:type="dxa"/>
+              <w:start w:w="90" w:type="dxa"/>
+              <w:bottom w:w="80" w:type="dxa"/>
+              <w:end w:w="90" w:type="dxa"/>
+            </w:tcMar>
+            <w:shd w:fill="EAF2F8"/>
+          </w:tcPr>
+          <w:p>
+            <w:pPr>
+              <w:spacing w:before="30" w:after="30" w:line="252" w:lineRule="auto"/>
+              <w:ind w:firstLine="0"/>
+              <w:jc w:val="center"/>
+            </w:pPr>
+            <w:r>
+              <w:rPr>
+                <w:rFonts w:ascii="Times New Roman" w:hAnsi="Times New Roman" w:eastAsia="宋体"/>
+                <w:color w:val="000000"/>
+                <w:sz w:val="16"/>
+              </w:rPr>
+              <w:t>神经工艺专家与工艺锚定回退</w:t>
+            </w:r>
+          </w:p>
+        </w:tc>
+      </w:tr>
+      <w:tr>
+        <w:tc>
+          <w:tcPr>
+            <w:tcW w:type="dxa" w:w="1928"/>
+            <w:vAlign w:val="center"/>
+            <w:tcMar>
+              <w:top w:w="80" w:type="dxa"/>
+              <w:start w:w="90" w:type="dxa"/>
+              <w:bottom w:w="80" w:type="dxa"/>
+              <w:end w:w="90" w:type="dxa"/>
+            </w:tcMar>
+          </w:tcPr>
+          <w:p>
+            <w:pPr>
+              <w:spacing w:before="30" w:after="30" w:line="252" w:lineRule="auto"/>
+              <w:ind w:firstLine="0"/>
+            </w:pPr>
+            <w:r>
+              <w:rPr>
+                <w:rFonts w:ascii="Times New Roman" w:hAnsi="Times New Roman" w:eastAsia="宋体"/>
+                <w:color w:val="000000"/>
+                <w:sz w:val="16"/>
+              </w:rPr>
+              <w:t>V1</w:t>
+            </w:r>
+          </w:p>
+        </w:tc>
+        <w:tc>
+          <w:tcPr>
+            <w:tcW w:type="dxa" w:w="1928"/>
+            <w:vAlign w:val="center"/>
+            <w:tcMar>
+              <w:top w:w="80" w:type="dxa"/>
+              <w:start w:w="90" w:type="dxa"/>
+              <w:bottom w:w="80" w:type="dxa"/>
+              <w:end w:w="90" w:type="dxa"/>
+            </w:tcMar>
+          </w:tcPr>
+          <w:p>
+            <w:pPr>
+              <w:spacing w:before="30" w:after="30" w:line="252" w:lineRule="auto"/>
+              <w:ind w:firstLine="0"/>
+              <w:jc w:val="center"/>
+            </w:pPr>
+            <w:r>
+              <w:rPr>
+                <w:rFonts w:ascii="Times New Roman" w:hAnsi="Times New Roman" w:eastAsia="宋体"/>
+                <w:color w:val="000000"/>
+                <w:sz w:val="16"/>
+              </w:rPr>
+              <w:t>仅振动CNN</w:t>
+            </w:r>
+          </w:p>
+        </w:tc>
+        <w:tc>
+          <w:tcPr>
+            <w:tcW w:type="dxa" w:w="1928"/>
+            <w:vAlign w:val="center"/>
+            <w:tcMar>
+              <w:top w:w="80" w:type="dxa"/>
+              <w:start w:w="90" w:type="dxa"/>
+              <w:bottom w:w="80" w:type="dxa"/>
+              <w:end w:w="90" w:type="dxa"/>
+            </w:tcMar>
+          </w:tcPr>
+          <w:p>
+            <w:pPr>
+              <w:spacing w:before="30" w:after="30" w:line="252" w:lineRule="auto"/>
+              <w:ind w:firstLine="0"/>
+              <w:jc w:val="center"/>
+            </w:pPr>
+            <w:r>
+              <w:rPr>
+                <w:rFonts w:ascii="Times New Roman" w:hAnsi="Times New Roman" w:eastAsia="宋体"/>
+                <w:color w:val="000000"/>
+                <w:sz w:val="16"/>
+              </w:rPr>
+              <w:t>三通道阶次谱</w:t>
+            </w:r>
+          </w:p>
+        </w:tc>
+        <w:tc>
+          <w:tcPr>
+            <w:tcW w:type="dxa" w:w="1928"/>
+            <w:vAlign w:val="center"/>
+            <w:tcMar>
+              <w:top w:w="80" w:type="dxa"/>
+              <w:start w:w="90" w:type="dxa"/>
+              <w:bottom w:w="80" w:type="dxa"/>
+              <w:end w:w="90" w:type="dxa"/>
+            </w:tcMar>
+          </w:tcPr>
+          <w:p>
+            <w:pPr>
+              <w:spacing w:before="30" w:after="30" w:line="252" w:lineRule="auto"/>
+              <w:ind w:firstLine="0"/>
+              <w:jc w:val="center"/>
+            </w:pPr>
+            <w:r>
+              <w:rPr>
+                <w:rFonts w:ascii="Times New Roman" w:hAnsi="Times New Roman" w:eastAsia="宋体"/>
+                <w:color w:val="000000"/>
+                <w:sz w:val="16"/>
+              </w:rPr>
+              <w:t>区域平均Ra</w:t>
+            </w:r>
+          </w:p>
+        </w:tc>
+        <w:tc>
+          <w:tcPr>
+            <w:tcW w:type="dxa" w:w="1928"/>
+            <w:vAlign w:val="center"/>
+            <w:tcMar>
+              <w:top w:w="80" w:type="dxa"/>
+              <w:start w:w="90" w:type="dxa"/>
+              <w:bottom w:w="80" w:type="dxa"/>
+              <w:end w:w="90" w:type="dxa"/>
+            </w:tcMar>
+          </w:tcPr>
+          <w:p>
+            <w:pPr>
+              <w:spacing w:before="30" w:after="30" w:line="252" w:lineRule="auto"/>
+              <w:ind w:firstLine="0"/>
+              <w:jc w:val="center"/>
+            </w:pPr>
+            <w:r>
+              <w:rPr>
+                <w:rFonts w:ascii="Times New Roman" w:hAnsi="Times New Roman" w:eastAsia="宋体"/>
+                <w:color w:val="000000"/>
+                <w:sz w:val="16"/>
+              </w:rPr>
+              <w:t>检验无工艺上下文的振动信息</w:t>
+            </w:r>
+          </w:p>
+        </w:tc>
+      </w:tr>
+      <w:tr>
+        <w:tc>
+          <w:tcPr>
+            <w:tcW w:type="dxa" w:w="1928"/>
+            <w:vAlign w:val="center"/>
+            <w:tcMar>
+              <w:top w:w="80" w:type="dxa"/>
+              <w:start w:w="90" w:type="dxa"/>
+              <w:bottom w:w="80" w:type="dxa"/>
+              <w:end w:w="90" w:type="dxa"/>
+            </w:tcMar>
+            <w:shd w:fill="EAF2F8"/>
+          </w:tcPr>
+          <w:p>
+            <w:pPr>
+              <w:spacing w:before="30" w:after="30" w:line="252" w:lineRule="auto"/>
+              <w:ind w:firstLine="0"/>
+            </w:pPr>
+            <w:r>
+              <w:rPr>
+                <w:rFonts w:ascii="Times New Roman" w:hAnsi="Times New Roman" w:eastAsia="宋体"/>
+                <w:color w:val="000000"/>
+                <w:sz w:val="16"/>
+              </w:rPr>
+              <w:t>F1</w:t>
+            </w:r>
+          </w:p>
+        </w:tc>
+        <w:tc>
+          <w:tcPr>
+            <w:tcW w:type="dxa" w:w="1928"/>
+            <w:vAlign w:val="center"/>
+            <w:tcMar>
+              <w:top w:w="80" w:type="dxa"/>
+              <w:start w:w="90" w:type="dxa"/>
+              <w:bottom w:w="80" w:type="dxa"/>
+              <w:end w:w="90" w:type="dxa"/>
+            </w:tcMar>
+            <w:shd w:fill="EAF2F8"/>
+          </w:tcPr>
+          <w:p>
+            <w:pPr>
+              <w:spacing w:before="30" w:after="30" w:line="252" w:lineRule="auto"/>
+              <w:ind w:firstLine="0"/>
+              <w:jc w:val="center"/>
+            </w:pPr>
+            <w:r>
+              <w:rPr>
+                <w:rFonts w:ascii="Times New Roman" w:hAnsi="Times New Roman" w:eastAsia="宋体"/>
+                <w:color w:val="000000"/>
+                <w:sz w:val="16"/>
+              </w:rPr>
+              <w:t>直接工艺—振动融合</w:t>
+            </w:r>
+          </w:p>
+        </w:tc>
+        <w:tc>
+          <w:tcPr>
+            <w:tcW w:type="dxa" w:w="1928"/>
+            <w:vAlign w:val="center"/>
+            <w:tcMar>
+              <w:top w:w="80" w:type="dxa"/>
+              <w:start w:w="90" w:type="dxa"/>
+              <w:bottom w:w="80" w:type="dxa"/>
+              <w:end w:w="90" w:type="dxa"/>
+            </w:tcMar>
+            <w:shd w:fill="EAF2F8"/>
+          </w:tcPr>
+          <w:p>
+            <w:pPr>
+              <w:spacing w:before="30" w:after="30" w:line="252" w:lineRule="auto"/>
+              <w:ind w:firstLine="0"/>
+              <w:jc w:val="center"/>
+            </w:pPr>
+            <w:r>
+              <w:rPr>
+                <w:rFonts w:ascii="Times New Roman" w:hAnsi="Times New Roman" w:eastAsia="宋体"/>
+                <w:color w:val="000000"/>
+                <w:sz w:val="16"/>
+              </w:rPr>
+              <w:t>工艺特征与阶次谱嵌入</w:t>
+            </w:r>
+          </w:p>
+        </w:tc>
+        <w:tc>
+          <w:tcPr>
+            <w:tcW w:type="dxa" w:w="1928"/>
+            <w:vAlign w:val="center"/>
+            <w:tcMar>
+              <w:top w:w="80" w:type="dxa"/>
+              <w:start w:w="90" w:type="dxa"/>
+              <w:bottom w:w="80" w:type="dxa"/>
+              <w:end w:w="90" w:type="dxa"/>
+            </w:tcMar>
+            <w:shd w:fill="EAF2F8"/>
+          </w:tcPr>
+          <w:p>
+            <w:pPr>
+              <w:spacing w:before="30" w:after="30" w:line="252" w:lineRule="auto"/>
+              <w:ind w:firstLine="0"/>
+              <w:jc w:val="center"/>
+            </w:pPr>
+            <w:r>
+              <w:rPr>
+                <w:rFonts w:ascii="Times New Roman" w:hAnsi="Times New Roman" w:eastAsia="宋体"/>
+                <w:color w:val="000000"/>
+                <w:sz w:val="16"/>
+              </w:rPr>
+              <w:t>区域平均Ra</w:t>
+            </w:r>
+          </w:p>
+        </w:tc>
+        <w:tc>
+          <w:tcPr>
+            <w:tcW w:type="dxa" w:w="1928"/>
+            <w:vAlign w:val="center"/>
+            <w:tcMar>
+              <w:top w:w="80" w:type="dxa"/>
+              <w:start w:w="90" w:type="dxa"/>
+              <w:bottom w:w="80" w:type="dxa"/>
+              <w:end w:w="90" w:type="dxa"/>
+            </w:tcMar>
+            <w:shd w:fill="EAF2F8"/>
+          </w:tcPr>
+          <w:p>
+            <w:pPr>
+              <w:spacing w:before="30" w:after="30" w:line="252" w:lineRule="auto"/>
+              <w:ind w:firstLine="0"/>
+              <w:jc w:val="center"/>
+            </w:pPr>
+            <w:r>
+              <w:rPr>
+                <w:rFonts w:ascii="Times New Roman" w:hAnsi="Times New Roman" w:eastAsia="宋体"/>
+                <w:color w:val="000000"/>
+                <w:sz w:val="16"/>
+              </w:rPr>
+              <w:t>朴素融合对照</w:t>
+            </w:r>
+          </w:p>
+        </w:tc>
+      </w:tr>
+      <w:tr>
+        <w:tc>
+          <w:tcPr>
+            <w:tcW w:type="dxa" w:w="1928"/>
+            <w:vAlign w:val="center"/>
+            <w:tcMar>
+              <w:top w:w="80" w:type="dxa"/>
+              <w:start w:w="90" w:type="dxa"/>
+              <w:bottom w:w="80" w:type="dxa"/>
+              <w:end w:w="90" w:type="dxa"/>
+            </w:tcMar>
+          </w:tcPr>
+          <w:p>
+            <w:pPr>
+              <w:spacing w:before="30" w:after="30" w:line="252" w:lineRule="auto"/>
+              <w:ind w:firstLine="0"/>
+            </w:pPr>
+            <w:r>
+              <w:rPr>
+                <w:rFonts w:ascii="Times New Roman" w:hAnsi="Times New Roman" w:eastAsia="宋体"/>
+                <w:color w:val="000000"/>
+                <w:sz w:val="16"/>
+              </w:rPr>
+              <w:t>R1</w:t>
+            </w:r>
+          </w:p>
+        </w:tc>
+        <w:tc>
+          <w:tcPr>
+            <w:tcW w:type="dxa" w:w="1928"/>
+            <w:vAlign w:val="center"/>
+            <w:tcMar>
+              <w:top w:w="80" w:type="dxa"/>
+              <w:start w:w="90" w:type="dxa"/>
+              <w:bottom w:w="80" w:type="dxa"/>
+              <w:end w:w="90" w:type="dxa"/>
+            </w:tcMar>
+          </w:tcPr>
+          <w:p>
+            <w:pPr>
+              <w:spacing w:before="30" w:after="30" w:line="252" w:lineRule="auto"/>
+              <w:ind w:firstLine="0"/>
+              <w:jc w:val="center"/>
+            </w:pPr>
+            <w:r>
+              <w:rPr>
+                <w:rFonts w:ascii="Times New Roman" w:hAnsi="Times New Roman" w:eastAsia="宋体"/>
+                <w:color w:val="000000"/>
+                <w:sz w:val="16"/>
+              </w:rPr>
+              <w:t>无门控残差融合</w:t>
+            </w:r>
+          </w:p>
+        </w:tc>
+        <w:tc>
+          <w:tcPr>
+            <w:tcW w:type="dxa" w:w="1928"/>
+            <w:vAlign w:val="center"/>
+            <w:tcMar>
+              <w:top w:w="80" w:type="dxa"/>
+              <w:start w:w="90" w:type="dxa"/>
+              <w:bottom w:w="80" w:type="dxa"/>
+              <w:end w:w="90" w:type="dxa"/>
+            </w:tcMar>
+          </w:tcPr>
+          <w:p>
+            <w:pPr>
+              <w:spacing w:before="30" w:after="30" w:line="252" w:lineRule="auto"/>
+              <w:ind w:firstLine="0"/>
+              <w:jc w:val="center"/>
+            </w:pPr>
+            <w:r>
+              <w:rPr>
+                <w:rFonts w:ascii="Times New Roman" w:hAnsi="Times New Roman" w:eastAsia="宋体"/>
+                <w:color w:val="000000"/>
+                <w:sz w:val="16"/>
+              </w:rPr>
+              <w:t>P1工艺均值与阶次谱嵌入</w:t>
+            </w:r>
+          </w:p>
+        </w:tc>
+        <w:tc>
+          <w:tcPr>
+            <w:tcW w:type="dxa" w:w="1928"/>
+            <w:vAlign w:val="center"/>
+            <w:tcMar>
+              <w:top w:w="80" w:type="dxa"/>
+              <w:start w:w="90" w:type="dxa"/>
+              <w:bottom w:w="80" w:type="dxa"/>
+              <w:end w:w="90" w:type="dxa"/>
+            </w:tcMar>
+          </w:tcPr>
+          <w:p>
+            <w:pPr>
+              <w:spacing w:before="30" w:after="30" w:line="252" w:lineRule="auto"/>
+              <w:ind w:firstLine="0"/>
+              <w:jc w:val="center"/>
+            </w:pPr>
+            <w:r>
+              <w:rPr>
+                <w:rFonts w:ascii="Times New Roman" w:hAnsi="Times New Roman" w:eastAsia="宋体"/>
+                <w:color w:val="000000"/>
+                <w:sz w:val="16"/>
+              </w:rPr>
+              <w:t>组安全P1折外残差</w:t>
+            </w:r>
+          </w:p>
+        </w:tc>
+        <w:tc>
+          <w:tcPr>
+            <w:tcW w:type="dxa" w:w="1928"/>
+            <w:vAlign w:val="center"/>
+            <w:tcMar>
+              <w:top w:w="80" w:type="dxa"/>
+              <w:start w:w="90" w:type="dxa"/>
+              <w:bottom w:w="80" w:type="dxa"/>
+              <w:end w:w="90" w:type="dxa"/>
+            </w:tcMar>
+          </w:tcPr>
+          <w:p>
+            <w:pPr>
+              <w:spacing w:before="30" w:after="30" w:line="252" w:lineRule="auto"/>
+              <w:ind w:firstLine="0"/>
+              <w:jc w:val="center"/>
+            </w:pPr>
+            <w:r>
+              <w:rPr>
+                <w:rFonts w:ascii="Times New Roman" w:hAnsi="Times New Roman" w:eastAsia="宋体"/>
+                <w:color w:val="000000"/>
+                <w:sz w:val="16"/>
+              </w:rPr>
+              <w:t>检验完整的可学习振动修正</w:t>
+            </w:r>
+          </w:p>
+        </w:tc>
+      </w:tr>
+      <w:tr>
+        <w:tc>
+          <w:tcPr>
+            <w:tcW w:type="dxa" w:w="1928"/>
+            <w:vAlign w:val="center"/>
+            <w:tcMar>
+              <w:top w:w="80" w:type="dxa"/>
+              <w:start w:w="90" w:type="dxa"/>
+              <w:bottom w:w="80" w:type="dxa"/>
+              <w:end w:w="90" w:type="dxa"/>
+            </w:tcMar>
+            <w:shd w:fill="EAF2F8"/>
+          </w:tcPr>
+          <w:p>
+            <w:pPr>
+              <w:spacing w:before="30" w:after="30" w:line="252" w:lineRule="auto"/>
+              <w:ind w:firstLine="0"/>
+            </w:pPr>
+            <w:r>
+              <w:rPr>
+                <w:rFonts w:ascii="Times New Roman" w:hAnsi="Times New Roman" w:eastAsia="宋体"/>
+                <w:color w:val="000000"/>
+                <w:sz w:val="16"/>
+              </w:rPr>
+              <w:t>G1</w:t>
+            </w:r>
+          </w:p>
+        </w:tc>
+        <w:tc>
+          <w:tcPr>
+            <w:tcW w:type="dxa" w:w="1928"/>
+            <w:vAlign w:val="center"/>
+            <w:tcMar>
+              <w:top w:w="80" w:type="dxa"/>
+              <w:start w:w="90" w:type="dxa"/>
+              <w:bottom w:w="80" w:type="dxa"/>
+              <w:end w:w="90" w:type="dxa"/>
+            </w:tcMar>
+            <w:shd w:fill="EAF2F8"/>
+          </w:tcPr>
+          <w:p>
+            <w:pPr>
+              <w:spacing w:before="30" w:after="30" w:line="252" w:lineRule="auto"/>
+              <w:ind w:firstLine="0"/>
+              <w:jc w:val="center"/>
+            </w:pPr>
+            <w:r>
+              <w:rPr>
+                <w:rFonts w:ascii="Times New Roman" w:hAnsi="Times New Roman" w:eastAsia="宋体"/>
+                <w:color w:val="000000"/>
+                <w:sz w:val="16"/>
+              </w:rPr>
+              <w:t>选择性门控残差融合</w:t>
+            </w:r>
+          </w:p>
+        </w:tc>
+        <w:tc>
+          <w:tcPr>
+            <w:tcW w:type="dxa" w:w="1928"/>
+            <w:vAlign w:val="center"/>
+            <w:tcMar>
+              <w:top w:w="80" w:type="dxa"/>
+              <w:start w:w="90" w:type="dxa"/>
+              <w:bottom w:w="80" w:type="dxa"/>
+              <w:end w:w="90" w:type="dxa"/>
+            </w:tcMar>
+            <w:shd w:fill="EAF2F8"/>
+          </w:tcPr>
+          <w:p>
+            <w:pPr>
+              <w:spacing w:before="30" w:after="30" w:line="252" w:lineRule="auto"/>
+              <w:ind w:firstLine="0"/>
+              <w:jc w:val="center"/>
+            </w:pPr>
+            <w:r>
+              <w:rPr>
+                <w:rFonts w:ascii="Times New Roman" w:hAnsi="Times New Roman" w:eastAsia="宋体"/>
+                <w:color w:val="000000"/>
+                <w:sz w:val="16"/>
+              </w:rPr>
+              <w:t>P1均值、残差嵌入、工艺特征与7个质量特征</w:t>
+            </w:r>
+          </w:p>
+        </w:tc>
+        <w:tc>
+          <w:tcPr>
+            <w:tcW w:type="dxa" w:w="1928"/>
+            <w:vAlign w:val="center"/>
+            <w:tcMar>
+              <w:top w:w="80" w:type="dxa"/>
+              <w:start w:w="90" w:type="dxa"/>
+              <w:bottom w:w="80" w:type="dxa"/>
+              <w:end w:w="90" w:type="dxa"/>
+            </w:tcMar>
+            <w:shd w:fill="EAF2F8"/>
+          </w:tcPr>
+          <w:p>
+            <w:pPr>
+              <w:spacing w:before="30" w:after="30" w:line="252" w:lineRule="auto"/>
+              <w:ind w:firstLine="0"/>
+              <w:jc w:val="center"/>
+            </w:pPr>
+            <w:r>
+              <w:rPr>
+                <w:rFonts w:ascii="Times New Roman" w:hAnsi="Times New Roman" w:eastAsia="宋体"/>
+                <w:color w:val="000000"/>
+                <w:sz w:val="16"/>
+              </w:rPr>
+              <w:t>组安全P1折外残差加门控修正</w:t>
+            </w:r>
+          </w:p>
+        </w:tc>
+        <w:tc>
+          <w:tcPr>
+            <w:tcW w:type="dxa" w:w="1928"/>
+            <w:vAlign w:val="center"/>
+            <w:tcMar>
+              <w:top w:w="80" w:type="dxa"/>
+              <w:start w:w="90" w:type="dxa"/>
+              <w:bottom w:w="80" w:type="dxa"/>
+              <w:end w:w="90" w:type="dxa"/>
+            </w:tcMar>
+            <w:shd w:fill="EAF2F8"/>
+          </w:tcPr>
+          <w:p>
+            <w:pPr>
+              <w:spacing w:before="30" w:after="30" w:line="252" w:lineRule="auto"/>
+              <w:ind w:firstLine="0"/>
+              <w:jc w:val="center"/>
+            </w:pPr>
+            <w:r>
+              <w:rPr>
+                <w:rFonts w:ascii="Times New Roman" w:hAnsi="Times New Roman" w:eastAsia="宋体"/>
+                <w:color w:val="000000"/>
+                <w:sz w:val="16"/>
+              </w:rPr>
+              <w:t>本文提出的选择性融合模型</w:t>
+            </w:r>
+          </w:p>
+        </w:tc>
+      </w:tr>
+    </w:tbl>
+    <w:p>
+      <w:pPr>
+        <w:spacing w:after="20"/>
+        <w:ind w:firstLine="0"/>
+      </w:pPr>
     </w:p>
     <w:p>
       <w:pPr>
@@ -6229,7 +8750,7 @@
           <w:color w:val="000000"/>
           <w:sz w:val="21"/>
         </w:rPr>
-        <w:t xml:space="preserve"> 组MAE超额阈值。Phase A中，M0的MAE、RMSE和 </w:t>
+        <w:t xml:space="preserve"> 组MAE超额阈值。面板B有意省略“获胜折数”列：注册的重复方案以3个种子作为重复单元，而非按外层折统计胜负。Phase A中，M0的MAE、RMSE和 </w:t>
       </w:r>
       <w:r>
         <w:drawing>
@@ -7816,7 +10337,7 @@
           <w:color w:val="000000"/>
           <w:sz w:val="21"/>
         </w:rPr>
-        <w:t>同方差90%区间取得95.18%单读数覆盖率、92.45%同时组覆盖率、0.643449 μm平均宽度和0.788720 Winkler分数；95%区间分别为97.46%、97.01%、0.902232 μm和1.047684。</w:t>
+        <w:t>表4中“—”表示该单元格与上一行同值：同一尺度模型下，高斯NLL与高斯CRPS不随名义保形水平变化，故不再重复。同方差90%区间取得95.18%单读数覆盖率、92.45%同时组覆盖率、0.643449 μm平均宽度和0.788720 Winkler分数；95%区间分别为97.46%、97.01%、0.902232 μm和1.047684。</w:t>
       </w:r>
     </w:p>
     <w:p>
@@ -9887,7 +12408,7 @@
           <w:color w:val="000000"/>
           <w:sz w:val="21"/>
         </w:rPr>
-        <w:t>“安全”因此必须保持限定。该机制没有证明每个未来组都不受损，也不是形式化安全认证。它只是在冻结的评价规则下，比直接或无门控融合更少触发实质性损害。</w:t>
+        <w:t>该机制没有证明每个未来组都不受损，也不是形式化认证。它只是在冻结的评价规则下，比直接或无门控融合更少触发实质性损害。</w:t>
       </w:r>
     </w:p>
     <w:p>

</xml_diff>